<commit_message>
add bathy to map
</commit_message>
<xml_diff>
--- a/revision/review_response.docx
+++ b/revision/review_response.docx
@@ -167,7 +167,7 @@
           <w:i/>
           <w:iCs/>
         </w:rPr>
-        <w:t xml:space="preserve">response</w:t>
+        <w:t xml:space="preserve">Added.</w:t>
       </w:r>
     </w:p>
     <w:p>
@@ -185,6 +185,26 @@
       </w:r>
       <w:r>
         <w:t xml:space="preserve">.</w:t>
+      </w:r>
+    </w:p>
+    <w:p>
+      <w:pPr>
+        <w:pStyle w:val="BodyText"/>
+      </w:pPr>
+      <w:r>
+        <w:rPr>
+          <w:i/>
+          <w:iCs/>
+        </w:rPr>
+        <w:t xml:space="preserve">Changed.</w:t>
+      </w:r>
+    </w:p>
+    <w:p>
+      <w:pPr>
+        <w:pStyle w:val="BodyText"/>
+      </w:pPr>
+      <w:r>
+        <w:t xml:space="preserve">3. Ln 141: Consider adding bathymetry data to Figure 1 (if available) to accompany description</w:t>
       </w:r>
     </w:p>
     <w:p>
@@ -204,7 +224,76 @@
         <w:pStyle w:val="BodyText"/>
       </w:pPr>
       <w:r>
-        <w:t xml:space="preserve">3. Ln 141: Consider adding bathymetry data to Figure 1 (if available) to accompany description</w:t>
+        <w:t xml:space="preserve">4. Ln 149: Add reference to Figure 2.</w:t>
+      </w:r>
+    </w:p>
+    <w:p>
+      <w:pPr>
+        <w:pStyle w:val="BodyText"/>
+      </w:pPr>
+      <w:r>
+        <w:rPr>
+          <w:i/>
+          <w:iCs/>
+        </w:rPr>
+        <w:t xml:space="preserve">The loading data in Figure 2 begins in 1985 and does not provide a comparison to those from the 1970s</w:t>
+      </w:r>
+      <w:r>
+        <w:rPr>
+          <w:i/>
+          <w:iCs/>
+        </w:rPr>
+        <w:t xml:space="preserve"> </w:t>
+      </w:r>
+      <w:r>
+        <w:rPr>
+          <w:i/>
+          <w:iCs/>
+        </w:rPr>
+        <w:t xml:space="preserve">“worst-case”</w:t>
+      </w:r>
+      <w:r>
+        <w:rPr>
+          <w:i/>
+          <w:iCs/>
+        </w:rPr>
+        <w:t xml:space="preserve"> </w:t>
+      </w:r>
+      <w:r>
+        <w:rPr>
+          <w:i/>
+          <w:iCs/>
+        </w:rPr>
+        <w:t xml:space="preserve">scenario. We have added a citation to the historical document from which those estimates were obtained and the current for comparison</w:t>
+      </w:r>
+      <w:r>
+        <w:rPr>
+          <w:i/>
+          <w:iCs/>
+        </w:rPr>
+        <w:t xml:space="preserve"> </w:t>
+      </w:r>
+      <w:r>
+        <w:rPr>
+          <w:i/>
+          <w:iCs/>
+        </w:rPr>
+        <w:t xml:space="preserve">(Zarbock et al., 1994; Janicki et al., 2023)</w:t>
+      </w:r>
+      <w:r>
+        <w:rPr>
+          <w:i/>
+          <w:iCs/>
+        </w:rPr>
+        <w:t xml:space="preserve">.</w:t>
+      </w:r>
+    </w:p>
+    <w:p>
+      <w:pPr>
+        <w:pStyle w:val="BodyText"/>
+      </w:pPr>
+      <w:r>
+        <w:t xml:space="preserve">5. Consider moving the last paragraph in methods (ln 158 - 175) to the introduction.</w:t>
       </w:r>
     </w:p>
     <w:p>
@@ -224,7 +313,7 @@
         <w:pStyle w:val="BodyText"/>
       </w:pPr>
       <w:r>
-        <w:t xml:space="preserve">4. Ln 149: Add reference to Figure 2.</w:t>
+        <w:t xml:space="preserve">6. Ln 213- 215: Add a citation to show this is a previously documented approach for dealing with long-term change as well as seasonal variability in the time component.</w:t>
       </w:r>
     </w:p>
     <w:p>
@@ -244,7 +333,7 @@
         <w:pStyle w:val="BodyText"/>
       </w:pPr>
       <w:r>
-        <w:t xml:space="preserve">5. Consider moving the last paragraph in methods (ln 158 - 175) to the introduction.</w:t>
+        <w:t xml:space="preserve">7. Ln 227 - 229: the justification for assuming a gamma distribution should be elaborated further</w:t>
       </w:r>
     </w:p>
     <w:p>
@@ -264,7 +353,7 @@
         <w:pStyle w:val="BodyText"/>
       </w:pPr>
       <w:r>
-        <w:t xml:space="preserve">6. Ln 213- 215: Add a citation to show this is a previously documented approach for dealing with long-term change as well as seasonal variability in the time component.</w:t>
+        <w:t xml:space="preserve">8. Ln 269: minimum and maximum observed over what time-period?</w:t>
       </w:r>
     </w:p>
     <w:p>
@@ -284,7 +373,7 @@
         <w:pStyle w:val="BodyText"/>
       </w:pPr>
       <w:r>
-        <w:t xml:space="preserve">7. Ln 227 - 229: the justification for assuming a gamma distribution should be elaborated further</w:t>
+        <w:t xml:space="preserve">9. Ln 274: over what time period was the mean loading computed?</w:t>
       </w:r>
     </w:p>
     <w:p>
@@ -304,7 +393,7 @@
         <w:pStyle w:val="BodyText"/>
       </w:pPr>
       <w:r>
-        <w:t xml:space="preserve">8. Ln 269: minimum and maximum observed over what time-period?</w:t>
+        <w:t xml:space="preserve">10. Ln 322: Are the chlorophyll-a thresholds defined in FDEP’s water quality standards? It would be helpful to clarify where these numbers come from. Citing Figure 2, which shows the relevant regulatory criteria would likely be sufficient.</w:t>
       </w:r>
     </w:p>
     <w:p>
@@ -324,7 +413,7 @@
         <w:pStyle w:val="BodyText"/>
       </w:pPr>
       <w:r>
-        <w:t xml:space="preserve">9. Ln 274: over what timeperiod was the mean loading computed?</w:t>
+        <w:t xml:space="preserve">11. Ln 349: Is the lower percent explained in LTB due to aliasing of tidal variability in salinity data since the data was depth-averaged?</w:t>
       </w:r>
     </w:p>
     <w:p>
@@ -344,7 +433,7 @@
         <w:pStyle w:val="BodyText"/>
       </w:pPr>
       <w:r>
-        <w:t xml:space="preserve">10. Ln 322: Are the chlorophyll-a thresholds defined in FDEP’s water quality standards? It would be helpful to clarify where these numbers come from. Citing Figure 2, which shows the relevant regulatory criteria would likely be sufficient.</w:t>
+        <w:t xml:space="preserve">12. Ln 353 - 356: I believe this is determined by the p-value, which should be clarified in the text.</w:t>
       </w:r>
     </w:p>
     <w:p>
@@ -364,7 +453,7 @@
         <w:pStyle w:val="BodyText"/>
       </w:pPr>
       <w:r>
-        <w:t xml:space="preserve">11. Ln 349: Is the lower percent explained in LTB due to aliasing of tidal variability in salinity data since the data was depth-averaged?</w:t>
+        <w:t xml:space="preserve">13. Ln 365 - 367: Is this because the water column is less stratified? Or because there is less episodic variation in the load, which decreases the likelihood of aliasing higher frequency variability due to storms? In general, some of the trends in model-data agreement across segments are not particularly surprising given the model setup.</w:t>
       </w:r>
     </w:p>
     <w:p>
@@ -384,7 +473,7 @@
         <w:pStyle w:val="BodyText"/>
       </w:pPr>
       <w:r>
-        <w:t xml:space="preserve">12. Ln 353 - 356: I believe this is determined by the p-value, which should be clarified in the text.</w:t>
+        <w:t xml:space="preserve">14. Figure 5: Consider showing the effect plots for the original GAM instead of the salinity-normalized analysis.</w:t>
       </w:r>
     </w:p>
     <w:p>
@@ -404,7 +493,7 @@
         <w:pStyle w:val="BodyText"/>
       </w:pPr>
       <w:r>
-        <w:t xml:space="preserve">13. Ln 365 - 367: Is this because the water column is less stratified? Or because there is less episodic variation in the load, which decreases the likelihood of aliasing higher frequency variability due to storms? In general, some of the trends in model-data agreement across segments are not particularly surprising given the model setup.</w:t>
+        <w:t xml:space="preserve">15. Figure 6: Consider making the x- and y-axis scales the same for the different segments because the e.g., stronger loading effect in OTB/HB isn’t immediately obvious. Also, are the lines necessary since the points are color-coded? You could instead use a color gradient to represent year as in Figure 3. This would lessen the need to have year labels, which should be described in the caption if included.</w:t>
       </w:r>
     </w:p>
     <w:p>
@@ -424,7 +513,7 @@
         <w:pStyle w:val="BodyText"/>
       </w:pPr>
       <w:r>
-        <w:t xml:space="preserve">14. Figure 5: Consider showing the effect plots for the original GAM instead of the salinity-normalized analysis.</w:t>
+        <w:t xml:space="preserve">16. Ln 554-55: Is high salinity attributable to high tidal exchange given the monthly data doesn’t resolve tidal variability? Or is it that the salinity is higher during the dry season? (this explanation seems more consistent with the sentences that follow).</w:t>
       </w:r>
     </w:p>
     <w:p>
@@ -439,12 +528,39 @@
         <w:t xml:space="preserve">response</w:t>
       </w:r>
     </w:p>
-    <w:p>
-      <w:pPr>
-        <w:pStyle w:val="BodyText"/>
-      </w:pPr>
-      <w:r>
-        <w:t xml:space="preserve">15. Figure 6: Consider making the x- and y-axis scales the same for the different segments because the e.g., stronger loading effect in OTB/HB isn’t immediately obvious. Also, are the lines necessary since the points are color-coded? You could instead use a color gradient to represent year as in Figure 3. This would lessen the need to have year labels, which should be described in the caption if included.</w:t>
+    <w:bookmarkEnd w:id="20"/>
+    <w:bookmarkStart w:id="21" w:name="reviewer-2"/>
+    <w:p>
+      <w:pPr>
+        <w:pStyle w:val="Heading3"/>
+      </w:pPr>
+      <w:r>
+        <w:t xml:space="preserve">Reviewer #2:</w:t>
+      </w:r>
+    </w:p>
+    <w:p>
+      <w:pPr>
+        <w:pStyle w:val="FirstParagraph"/>
+      </w:pPr>
+      <w:r>
+        <w:t xml:space="preserve">The authors build a Generalized Additive Models (GAMs) to model chlorophyll-a as a function of time, salinity, nutrient load and their derivative to understand historical relationship as well as project future potential management actions that may be needed in Old Tampa Bay, Florida, USA.</w:t>
+      </w:r>
+    </w:p>
+    <w:p>
+      <w:pPr>
+        <w:pStyle w:val="BodyText"/>
+      </w:pPr>
+      <w:r>
+        <w:t xml:space="preserve">The paper has a clear objective, analysis and conclusion to support the findings. My main concern is the lack of Exploratory Data Analysis (EDA) to not only justify the model but provide readers with potential transferability contribution to other areas of the world. Even leaving out other variables that may explain chlorophyll-a, there was no justification as to the form of preselected variables. On Line 220- 222, the authors say,</w:t>
+      </w:r>
+      <w:r>
+        <w:t xml:space="preserve"> </w:t>
+      </w:r>
+      <w:r>
+        <w:t xml:space="preserve">“no efforts were made for carriable section since the same model structure for describing drivers and scenario testing between bay segments was desired (objective 2 and (3)”</w:t>
+      </w:r>
+      <w:r>
+        <w:t xml:space="preserve">. There is an issue in this statement, because it implies that as long as one is interested in potential differences (between historical and some future time of a variable), how one came up with the model has less influence. In addition, the justification to say what is done is what is mentioned in the objective seems difficult reasoning to follow. Yes, it is important to address what is promised in the objective, but if the objective needs to be relaxed to put EDA in the work, I would suggest it should be.</w:t>
       </w:r>
     </w:p>
     <w:p>
@@ -464,7 +580,25 @@
         <w:pStyle w:val="BodyText"/>
       </w:pPr>
       <w:r>
-        <w:t xml:space="preserve">16. Ln 554-55: Is high salinity attributable to high tidal exchange given the monthly data doesn’t resolve tidal variability? Or is it that the salinity is higher during the dry season? (this explanation seems more consistent with the sentences that follow).</w:t>
+        <w:t xml:space="preserve">Other minor comments are 1) Given the lack of documented EDA, I am not sure about the value of two-time variables. Both are basically taking care of seasonality. The same is true with interaction terms. What are the justifications for those terms? 2) Line 68 to 70 says</w:t>
+      </w:r>
+      <w:r>
+        <w:t xml:space="preserve"> </w:t>
+      </w:r>
+      <w:r>
+        <w:t xml:space="preserve">“This study is an explicit follow-up to Beck et al. (2024) by providing a quantitative assessment of the relative risk of exceeding regulatory standards under future climate change.”</w:t>
+      </w:r>
+      <w:r>
+        <w:t xml:space="preserve"> </w:t>
+      </w:r>
+      <w:r>
+        <w:t xml:space="preserve">I did not see any analysis support for this statement. Please include supporting material or remove it.</w:t>
+      </w:r>
+      <w:r>
+        <w:t xml:space="preserve"> </w:t>
+      </w:r>
+      <w:r>
+        <w:t xml:space="preserve">Overall, this is a great study and could be improved by adding some form of EDA that readers can take away from this study.</w:t>
       </w:r>
     </w:p>
     <w:p>
@@ -479,92 +613,161 @@
         <w:t xml:space="preserve">response</w:t>
       </w:r>
     </w:p>
-    <w:bookmarkEnd w:id="20"/>
-    <w:bookmarkStart w:id="21" w:name="reviewer-2"/>
-    <w:p>
-      <w:pPr>
-        <w:pStyle w:val="Heading3"/>
-      </w:pPr>
-      <w:r>
-        <w:t xml:space="preserve">Reviewer #2:</w:t>
-      </w:r>
-    </w:p>
-    <w:p>
-      <w:pPr>
-        <w:pStyle w:val="FirstParagraph"/>
-      </w:pPr>
-      <w:r>
-        <w:t xml:space="preserve">The authors build a Generalized Additive Models (GAMs) to model chlorophyll-a as a function of time, salinity, nutrient load and their derivative to understand historical relationship as well as project future potential management actions that may be needed in Old Tampa Bay, Florida, USA.</w:t>
-      </w:r>
-    </w:p>
-    <w:p>
-      <w:pPr>
-        <w:pStyle w:val="BodyText"/>
-      </w:pPr>
-      <w:r>
-        <w:t xml:space="preserve">The paper has a clear objective, analysis and conclusion to support the findings. My main concern is the lack of Exploratory Data Analysis (EDA) to not only justify the model but provide readers with potential transferability contribution to other areas of the world. Even leaving out other variables that may explain chlorophyll-a, there was no justification as to the form of preselected variables. On Line 220- 222, the authors say,</w:t>
+    <w:bookmarkEnd w:id="21"/>
+    <w:bookmarkStart w:id="26" w:name="references"/>
+    <w:p>
+      <w:pPr>
+        <w:pStyle w:val="Heading2"/>
+      </w:pPr>
+      <w:r>
+        <w:t xml:space="preserve">References</w:t>
+      </w:r>
+    </w:p>
+    <w:bookmarkStart w:id="25" w:name="refs"/>
+    <w:bookmarkStart w:id="22" w:name="ref-janicki23"/>
+    <w:p>
+      <w:pPr>
+        <w:pStyle w:val="Bibliography"/>
+      </w:pPr>
+      <w:r>
+        <w:t xml:space="preserve">Janicki, A. J., J. R. Pribble, H. Zarbock, and D. Wade. 2023. A look back at long-term trends in nitrogen loading to</w:t>
       </w:r>
       <w:r>
         <w:t xml:space="preserve"> </w:t>
       </w:r>
       <w:r>
-        <w:t xml:space="preserve">“no efforts were made for carriable section since the same model structure for describing drivers and scenario testing between bay segments was desired (objective 2 and (3)”</w:t>
-      </w:r>
-      <w:r>
-        <w:t xml:space="preserve">. There is an issue in this statement, because it implies that as long as one is interested in potential differences (between historical and some future time of a variable), how one came up with the model has less influence. In addition, the justification to say what is done is what is mentioned in the objective seems difficult reasoning to follow. Yes, it is important to address what is promised in the objective, but if the objective needs to be relaxed to put EDA in the work, I would suggest it should be.</w:t>
-      </w:r>
-    </w:p>
-    <w:p>
-      <w:pPr>
-        <w:pStyle w:val="BodyText"/>
-      </w:pPr>
+        <w:t xml:space="preserve">T</w:t>
+      </w:r>
+      <w:r>
+        <w:t xml:space="preserve">ampa</w:t>
+      </w:r>
+      <w:r>
+        <w:t xml:space="preserve"> </w:t>
+      </w:r>
+      <w:r>
+        <w:t xml:space="preserve">B</w:t>
+      </w:r>
+      <w:r>
+        <w:t xml:space="preserve">ay.</w:t>
+      </w:r>
+      <w:r>
+        <w:t xml:space="preserve"> </w:t>
+      </w:r>
       <w:r>
         <w:rPr>
           <w:i/>
           <w:iCs/>
         </w:rPr>
-        <w:t xml:space="preserve">response</w:t>
-      </w:r>
-    </w:p>
-    <w:p>
-      <w:pPr>
-        <w:pStyle w:val="BodyText"/>
-      </w:pPr>
-      <w:r>
-        <w:t xml:space="preserve">Other minor comments are 1) Given the lack of documented EDA, I am not sure about the value of two-time variables. Both are basically taking care of seasonality. The same is true with interaction terms. What are the justifications for those terms? 2) Line 68 to 70 says</w:t>
+        <w:t xml:space="preserve">Florida Scientist</w:t>
       </w:r>
       <w:r>
         <w:t xml:space="preserve"> </w:t>
       </w:r>
       <w:r>
-        <w:t xml:space="preserve">“This study is an explicit follow-up to Beck et al. (2024) by providing a quantitative assessment of the relative risk of exceeding regulatory standards under future climate change.”</w:t>
+        <w:t xml:space="preserve">86: 255–263.</w:t>
+      </w:r>
+    </w:p>
+    <w:bookmarkEnd w:id="22"/>
+    <w:bookmarkStart w:id="24" w:name="ref-tbep0494"/>
+    <w:p>
+      <w:pPr>
+        <w:pStyle w:val="Bibliography"/>
+      </w:pPr>
+      <w:r>
+        <w:t xml:space="preserve">Zarbock, H. W., A. J. Janicki, D. L. Wade, and D. G. Heimbuch. 1994.</w:t>
       </w:r>
       <w:r>
         <w:t xml:space="preserve"> </w:t>
       </w:r>
-      <w:r>
-        <w:t xml:space="preserve">I did not see any analysis support for this statement. Please include supporting material or remove it.</w:t>
-      </w:r>
-      <w:r>
-        <w:t xml:space="preserve"> </w:t>
-      </w:r>
-      <w:r>
-        <w:t xml:space="preserve">Overall, this is a great study and could be improved by adding some form of EDA that readers can take away from this study.</w:t>
-      </w:r>
-    </w:p>
-    <w:p>
-      <w:pPr>
-        <w:pStyle w:val="BodyText"/>
-      </w:pPr>
-      <w:r>
-        <w:rPr>
-          <w:i/>
-          <w:iCs/>
-        </w:rPr>
-        <w:t xml:space="preserve">response</w:t>
-      </w:r>
-    </w:p>
-    <w:bookmarkEnd w:id="21"/>
+      <w:hyperlink r:id="rId23">
+        <w:r>
+          <w:rPr>
+            <w:rStyle w:val="Hyperlink"/>
+            <w:i/>
+            <w:iCs/>
+          </w:rPr>
+          <w:t xml:space="preserve">Estimates of total nitrogen, total phosphorus, and total suspended solids loadings to</w:t>
+        </w:r>
+        <w:r>
+          <w:rPr>
+            <w:rStyle w:val="Hyperlink"/>
+            <w:i/>
+            <w:iCs/>
+          </w:rPr>
+          <w:t xml:space="preserve"> </w:t>
+        </w:r>
+        <w:r>
+          <w:rPr>
+            <w:rStyle w:val="Hyperlink"/>
+            <w:i/>
+            <w:iCs/>
+          </w:rPr>
+          <w:t xml:space="preserve">T</w:t>
+        </w:r>
+        <w:r>
+          <w:rPr>
+            <w:rStyle w:val="Hyperlink"/>
+            <w:i/>
+            <w:iCs/>
+          </w:rPr>
+          <w:t xml:space="preserve">ampa</w:t>
+        </w:r>
+        <w:r>
+          <w:rPr>
+            <w:rStyle w:val="Hyperlink"/>
+            <w:i/>
+            <w:iCs/>
+          </w:rPr>
+          <w:t xml:space="preserve"> </w:t>
+        </w:r>
+        <w:r>
+          <w:rPr>
+            <w:rStyle w:val="Hyperlink"/>
+            <w:i/>
+            <w:iCs/>
+          </w:rPr>
+          <w:t xml:space="preserve">B</w:t>
+        </w:r>
+        <w:r>
+          <w:rPr>
+            <w:rStyle w:val="Hyperlink"/>
+            <w:i/>
+            <w:iCs/>
+          </w:rPr>
+          <w:t xml:space="preserve">ay,</w:t>
+        </w:r>
+        <w:r>
+          <w:rPr>
+            <w:rStyle w:val="Hyperlink"/>
+            <w:i/>
+            <w:iCs/>
+          </w:rPr>
+          <w:t xml:space="preserve"> </w:t>
+        </w:r>
+        <w:r>
+          <w:rPr>
+            <w:rStyle w:val="Hyperlink"/>
+            <w:i/>
+            <w:iCs/>
+          </w:rPr>
+          <w:t xml:space="preserve">F</w:t>
+        </w:r>
+        <w:r>
+          <w:rPr>
+            <w:rStyle w:val="Hyperlink"/>
+            <w:i/>
+            <w:iCs/>
+          </w:rPr>
+          <w:t xml:space="preserve">lorida</w:t>
+        </w:r>
+      </w:hyperlink>
+      <w:r>
+        <w:t xml:space="preserve">. Technical report 04-94. St. Petersburg, Florida: Tampa Bay Estuary Program.</w:t>
+      </w:r>
+    </w:p>
+    <w:bookmarkEnd w:id="24"/>
+    <w:bookmarkEnd w:id="25"/>
+    <w:bookmarkEnd w:id="26"/>
     <w:sectPr>
       <w:footerReference r:id="rId9" w:type="default"/>
       <w:pgSz w:h="15840" w:w="12240"/>

</xml_diff>

<commit_message>
added AIC comparison table for gamma v gaussian
</commit_message>
<xml_diff>
--- a/revision/review_response.docx
+++ b/revision/review_response.docx
@@ -216,7 +216,7 @@
           <w:i/>
           <w:iCs/>
         </w:rPr>
-        <w:t xml:space="preserve">response</w:t>
+        <w:t xml:space="preserve">Bathymetry was added to the figure, in addition to some legend items to make the elements more readable.</w:t>
       </w:r>
     </w:p>
     <w:p>
@@ -305,7 +305,7 @@
           <w:i/>
           <w:iCs/>
         </w:rPr>
-        <w:t xml:space="preserve">response</w:t>
+        <w:t xml:space="preserve">This paragraph was moved to the second to last paragraph of the introduction.</w:t>
       </w:r>
     </w:p>
     <w:p>
@@ -325,7 +325,35 @@
           <w:i/>
           <w:iCs/>
         </w:rPr>
-        <w:t xml:space="preserve">response</w:t>
+        <w:t xml:space="preserve">A citation to</w:t>
+      </w:r>
+      <w:r>
+        <w:rPr>
+          <w:i/>
+          <w:iCs/>
+        </w:rPr>
+        <w:t xml:space="preserve"> </w:t>
+      </w:r>
+      <w:r>
+        <w:rPr>
+          <w:i/>
+          <w:iCs/>
+        </w:rPr>
+        <w:t xml:space="preserve">Beck et al. (2022)</w:t>
+      </w:r>
+      <w:r>
+        <w:rPr>
+          <w:i/>
+          <w:iCs/>
+        </w:rPr>
+        <w:t xml:space="preserve"> </w:t>
+      </w:r>
+      <w:r>
+        <w:rPr>
+          <w:i/>
+          <w:iCs/>
+        </w:rPr>
+        <w:t xml:space="preserve">was added since this was the origin of the concept.</w:t>
       </w:r>
     </w:p>
     <w:p>
@@ -345,7 +373,40 @@
           <w:i/>
           <w:iCs/>
         </w:rPr>
-        <w:t xml:space="preserve">response</w:t>
+        <w:t xml:space="preserve">Text was added about justification for the distribution and a table showing a comparison of Gaussian/log-link with the existing Gamma models was included in supplement.</w:t>
+      </w:r>
+    </w:p>
+    <w:p>
+      <w:pPr>
+        <w:pStyle w:val="BodyText"/>
+      </w:pPr>
+      <w:r>
+        <w:rPr>
+          <w:i/>
+          <w:iCs/>
+        </w:rPr>
+        <w:t xml:space="preserve">“Models using a Gaussian distribution with a log-link function were also evaluated, although using a Gamma distribution was superior when compared with Akaike information criterion</w:t>
+      </w:r>
+      <w:r>
+        <w:rPr>
+          <w:i/>
+          <w:iCs/>
+        </w:rPr>
+        <w:t xml:space="preserve"> </w:t>
+      </w:r>
+      <w:r>
+        <w:rPr>
+          <w:i/>
+          <w:iCs/>
+        </w:rPr>
+        <w:t xml:space="preserve">(Akaike, 1974, Table S1)</w:t>
+      </w:r>
+      <w:r>
+        <w:rPr>
+          <w:i/>
+          <w:iCs/>
+        </w:rPr>
+        <w:t xml:space="preserve">.”</w:t>
       </w:r>
     </w:p>
     <w:p>
@@ -614,7 +675,7 @@
       </w:r>
     </w:p>
     <w:bookmarkEnd w:id="21"/>
-    <w:bookmarkStart w:id="26" w:name="references"/>
+    <w:bookmarkStart w:id="30" w:name="references"/>
     <w:p>
       <w:pPr>
         <w:pStyle w:val="Heading2"/>
@@ -623,13 +684,107 @@
         <w:t xml:space="preserve">References</w:t>
       </w:r>
     </w:p>
-    <w:bookmarkStart w:id="25" w:name="refs"/>
-    <w:bookmarkStart w:id="22" w:name="ref-janicki23"/>
+    <w:bookmarkStart w:id="29" w:name="refs"/>
+    <w:bookmarkStart w:id="23" w:name="ref-akaike1974"/>
     <w:p>
       <w:pPr>
         <w:pStyle w:val="Bibliography"/>
       </w:pPr>
       <w:r>
+        <w:t xml:space="preserve">Akaike, H. 1974. A new look at the statistical model identification.</w:t>
+      </w:r>
+      <w:r>
+        <w:t xml:space="preserve"> </w:t>
+      </w:r>
+      <w:r>
+        <w:rPr>
+          <w:i/>
+          <w:iCs/>
+        </w:rPr>
+        <w:t xml:space="preserve">IEEE</w:t>
+      </w:r>
+      <w:r>
+        <w:rPr>
+          <w:i/>
+          <w:iCs/>
+        </w:rPr>
+        <w:t xml:space="preserve"> </w:t>
+      </w:r>
+      <w:r>
+        <w:rPr>
+          <w:i/>
+          <w:iCs/>
+        </w:rPr>
+        <w:t xml:space="preserve">Transactions on Automatic Control</w:t>
+      </w:r>
+      <w:r>
+        <w:t xml:space="preserve"> </w:t>
+      </w:r>
+      <w:r>
+        <w:t xml:space="preserve">19. IEEE: 716–723.</w:t>
+      </w:r>
+      <w:r>
+        <w:t xml:space="preserve"> </w:t>
+      </w:r>
+      <w:hyperlink r:id="rId22">
+        <w:r>
+          <w:rPr>
+            <w:rStyle w:val="Hyperlink"/>
+          </w:rPr>
+          <w:t xml:space="preserve">https://doi.org/10.1109/TAC.1974.1100705</w:t>
+        </w:r>
+      </w:hyperlink>
+      <w:r>
+        <w:t xml:space="preserve">.</w:t>
+      </w:r>
+    </w:p>
+    <w:bookmarkEnd w:id="23"/>
+    <w:bookmarkStart w:id="25" w:name="ref-beck2022b"/>
+    <w:p>
+      <w:pPr>
+        <w:pStyle w:val="Bibliography"/>
+      </w:pPr>
+      <w:r>
+        <w:t xml:space="preserve">Beck, M. W., P. deValpine, R. Murphy, I. Wren, A. Chelsky, M. Foley, and D. B. Senn. 2022. Multi-scale trend analysis of water quality using error propagation of generalized additive models.</w:t>
+      </w:r>
+      <w:r>
+        <w:t xml:space="preserve"> </w:t>
+      </w:r>
+      <w:r>
+        <w:rPr>
+          <w:i/>
+          <w:iCs/>
+        </w:rPr>
+        <w:t xml:space="preserve">Science of The Total Environment</w:t>
+      </w:r>
+      <w:r>
+        <w:t xml:space="preserve"> </w:t>
+      </w:r>
+      <w:r>
+        <w:t xml:space="preserve">802: 149927.</w:t>
+      </w:r>
+      <w:r>
+        <w:t xml:space="preserve"> </w:t>
+      </w:r>
+      <w:hyperlink r:id="rId24">
+        <w:r>
+          <w:rPr>
+            <w:rStyle w:val="Hyperlink"/>
+          </w:rPr>
+          <w:t xml:space="preserve">https://doi.org/10.1016/j.scitotenv.2021.149927</w:t>
+        </w:r>
+      </w:hyperlink>
+      <w:r>
+        <w:t xml:space="preserve">.</w:t>
+      </w:r>
+    </w:p>
+    <w:bookmarkEnd w:id="25"/>
+    <w:bookmarkStart w:id="26" w:name="ref-janicki23"/>
+    <w:p>
+      <w:pPr>
+        <w:pStyle w:val="Bibliography"/>
+      </w:pPr>
+      <w:r>
         <w:t xml:space="preserve">Janicki, A. J., J. R. Pribble, H. Zarbock, and D. Wade. 2023. A look back at long-term trends in nitrogen loading to</w:t>
       </w:r>
       <w:r>
@@ -667,8 +822,8 @@
         <w:t xml:space="preserve">86: 255–263.</w:t>
       </w:r>
     </w:p>
-    <w:bookmarkEnd w:id="22"/>
-    <w:bookmarkStart w:id="24" w:name="ref-tbep0494"/>
+    <w:bookmarkEnd w:id="26"/>
+    <w:bookmarkStart w:id="28" w:name="ref-tbep0494"/>
     <w:p>
       <w:pPr>
         <w:pStyle w:val="Bibliography"/>
@@ -679,7 +834,7 @@
       <w:r>
         <w:t xml:space="preserve"> </w:t>
       </w:r>
-      <w:hyperlink r:id="rId23">
+      <w:hyperlink r:id="rId27">
         <w:r>
           <w:rPr>
             <w:rStyle w:val="Hyperlink"/>
@@ -765,9 +920,9 @@
         <w:t xml:space="preserve">. Technical report 04-94. St. Petersburg, Florida: Tampa Bay Estuary Program.</w:t>
       </w:r>
     </w:p>
-    <w:bookmarkEnd w:id="24"/>
-    <w:bookmarkEnd w:id="25"/>
-    <w:bookmarkEnd w:id="26"/>
+    <w:bookmarkEnd w:id="28"/>
+    <w:bookmarkEnd w:id="29"/>
+    <w:bookmarkEnd w:id="30"/>
     <w:sectPr>
       <w:footerReference r:id="rId9" w:type="default"/>
       <w:pgSz w:h="15840" w:w="12240"/>

</xml_diff>

<commit_message>
finish supp fig for ti() effects plots
</commit_message>
<xml_diff>
--- a/revision/review_response.docx
+++ b/revision/review_response.docx
@@ -426,6 +426,115 @@
           <w:i/>
           <w:iCs/>
         </w:rPr>
+        <w:t xml:space="preserve">Text was modified to</w:t>
+      </w:r>
+      <w:r>
+        <w:rPr>
+          <w:i/>
+          <w:iCs/>
+        </w:rPr>
+        <w:t xml:space="preserve"> </w:t>
+      </w:r>
+      <w:r>
+        <w:rPr>
+          <w:i/>
+          <w:iCs/>
+        </w:rPr>
+        <w:t xml:space="preserve">“minimum and maximum observed over the period of record for each bay segment”</w:t>
+      </w:r>
+      <w:r>
+        <w:rPr>
+          <w:i/>
+          <w:iCs/>
+        </w:rPr>
+        <w:t xml:space="preserve">.</w:t>
+      </w:r>
+    </w:p>
+    <w:p>
+      <w:pPr>
+        <w:pStyle w:val="BodyText"/>
+      </w:pPr>
+      <w:r>
+        <w:t xml:space="preserve">9. Ln 274: over what time period was the mean loading computed?</w:t>
+      </w:r>
+    </w:p>
+    <w:p>
+      <w:pPr>
+        <w:pStyle w:val="BodyText"/>
+      </w:pPr>
+      <w:r>
+        <w:rPr>
+          <w:i/>
+          <w:iCs/>
+        </w:rPr>
+        <w:t xml:space="preserve">This was also the mean loading for the period of record for each bay segment, similar to salinity. Text was modified similarly as the previous response.</w:t>
+      </w:r>
+    </w:p>
+    <w:p>
+      <w:pPr>
+        <w:pStyle w:val="BodyText"/>
+      </w:pPr>
+      <w:r>
+        <w:t xml:space="preserve">10. Ln 322: Are the chlorophyll-a thresholds defined in FDEP’s water quality standards? It would be helpful to clarify where these numbers come from. Citing Figure 2, which shows the relevant regulatory criteria would likely be sufficient.</w:t>
+      </w:r>
+    </w:p>
+    <w:p>
+      <w:pPr>
+        <w:pStyle w:val="BodyText"/>
+      </w:pPr>
+      <w:r>
+        <w:rPr>
+          <w:i/>
+          <w:iCs/>
+        </w:rPr>
+        <w:t xml:space="preserve">Yes, the chlorophyll-a thresholds are FDEP standards under the bay’s Reasonable Assurance Plan. A citation to Figure 2 was included and</w:t>
+      </w:r>
+      <w:r>
+        <w:rPr>
+          <w:i/>
+          <w:iCs/>
+        </w:rPr>
+        <w:t xml:space="preserve"> </w:t>
+      </w:r>
+      <w:r>
+        <w:rPr>
+          <w:i/>
+          <w:iCs/>
+        </w:rPr>
+        <w:t xml:space="preserve">“regulatory”</w:t>
+      </w:r>
+      <w:r>
+        <w:rPr>
+          <w:i/>
+          <w:iCs/>
+        </w:rPr>
+        <w:t xml:space="preserve"> </w:t>
+      </w:r>
+      <w:r>
+        <w:rPr>
+          <w:i/>
+          <w:iCs/>
+        </w:rPr>
+        <w:t xml:space="preserve">was added as a text qualifier for the chlorophyll-a thresholds.</w:t>
+      </w:r>
+    </w:p>
+    <w:p>
+      <w:pPr>
+        <w:pStyle w:val="BodyText"/>
+      </w:pPr>
+      <w:r>
+        <w:t xml:space="preserve">11. Ln 349: Is the lower percent explained in LTB due to aliasing of tidal variability in salinity data since the data was depth-averaged?</w:t>
+      </w:r>
+    </w:p>
+    <w:p>
+      <w:pPr>
+        <w:pStyle w:val="BodyText"/>
+      </w:pPr>
+      <w:r>
+        <w:rPr>
+          <w:i/>
+          <w:iCs/>
+        </w:rPr>
         <w:t xml:space="preserve">response</w:t>
       </w:r>
     </w:p>
@@ -434,66 +543,6 @@
         <w:pStyle w:val="BodyText"/>
       </w:pPr>
       <w:r>
-        <w:t xml:space="preserve">9. Ln 274: over what time period was the mean loading computed?</w:t>
-      </w:r>
-    </w:p>
-    <w:p>
-      <w:pPr>
-        <w:pStyle w:val="BodyText"/>
-      </w:pPr>
-      <w:r>
-        <w:rPr>
-          <w:i/>
-          <w:iCs/>
-        </w:rPr>
-        <w:t xml:space="preserve">response</w:t>
-      </w:r>
-    </w:p>
-    <w:p>
-      <w:pPr>
-        <w:pStyle w:val="BodyText"/>
-      </w:pPr>
-      <w:r>
-        <w:t xml:space="preserve">10. Ln 322: Are the chlorophyll-a thresholds defined in FDEP’s water quality standards? It would be helpful to clarify where these numbers come from. Citing Figure 2, which shows the relevant regulatory criteria would likely be sufficient.</w:t>
-      </w:r>
-    </w:p>
-    <w:p>
-      <w:pPr>
-        <w:pStyle w:val="BodyText"/>
-      </w:pPr>
-      <w:r>
-        <w:rPr>
-          <w:i/>
-          <w:iCs/>
-        </w:rPr>
-        <w:t xml:space="preserve">response</w:t>
-      </w:r>
-    </w:p>
-    <w:p>
-      <w:pPr>
-        <w:pStyle w:val="BodyText"/>
-      </w:pPr>
-      <w:r>
-        <w:t xml:space="preserve">11. Ln 349: Is the lower percent explained in LTB due to aliasing of tidal variability in salinity data since the data was depth-averaged?</w:t>
-      </w:r>
-    </w:p>
-    <w:p>
-      <w:pPr>
-        <w:pStyle w:val="BodyText"/>
-      </w:pPr>
-      <w:r>
-        <w:rPr>
-          <w:i/>
-          <w:iCs/>
-        </w:rPr>
-        <w:t xml:space="preserve">response</w:t>
-      </w:r>
-    </w:p>
-    <w:p>
-      <w:pPr>
-        <w:pStyle w:val="BodyText"/>
-      </w:pPr>
-      <w:r>
         <w:t xml:space="preserve">12. Ln 353 - 356: I believe this is determined by the p-value, which should be clarified in the text.</w:t>
       </w:r>
     </w:p>
@@ -506,7 +555,21 @@
           <w:i/>
           <w:iCs/>
         </w:rPr>
-        <w:t xml:space="preserve">response</w:t>
+        <w:t xml:space="preserve">Yes, this is correct, although we note that the journal discourages general statements about p-values. We revised the sentence to include more detail about these main effects:</w:t>
+      </w:r>
+      <w:r>
+        <w:rPr>
+          <w:i/>
+          <w:iCs/>
+        </w:rPr>
+        <w:t xml:space="preserve"> </w:t>
+      </w:r>
+      <w:r>
+        <w:rPr>
+          <w:i/>
+          <w:iCs/>
+        </w:rPr>
+        <w:t xml:space="preserve">“All bay segments had individual smoothers for decimal time, day of year, and salinity that explained a unique portion of the variance in chlorophyll-a (Table 1), although the defined relationships varied from linear (estimated degrees of freedom, edf = 1; e.g., decimal time for OTB, salinity for OTB and HB) to highly non-linear (edf &gt;&gt; 1; day of year for all bay segments).”</w:t>
       </w:r>
     </w:p>
     <w:p>
@@ -526,7 +589,7 @@
           <w:i/>
           <w:iCs/>
         </w:rPr>
-        <w:t xml:space="preserve">response</w:t>
+        <w:t xml:space="preserve">Since stratification does not occur regularly in Tampa Bay, the decreased fit in the wet season is likely due to higher variability in chlorophyll-a and additional factors beyond those included in the model that could influence primary productivity. Conversely, it is very possible that chlorophyll-a during the dry season is captured more fully by the time variables in the model (decimal time, day or year) as other parameters have less of an influence outside of the growing season. We agree, though, that these results are not particularly surprising but it is worth explaining times when the models performed better or worse to help the reader understand factors that could influence chlorophyll-a dynamics.</w:t>
       </w:r>
     </w:p>
     <w:p>
@@ -546,7 +609,7 @@
           <w:i/>
           <w:iCs/>
         </w:rPr>
-        <w:t xml:space="preserve">response</w:t>
+        <w:t xml:space="preserve">We retain figure 5 because it is central to the second objective of the paper to identify how these models can be used to disambiguate the individual effects of salinity and loading, particularly over time as in the current figures (the effects plots from standard GAM output show the effects across the range of the parameters, not time). However, we have included conventional GAM effects plot for each model in the supplement to help the reader better visualize the smoothers and their interactions (Figures S2 and S3).</w:t>
       </w:r>
     </w:p>
     <w:p>

</xml_diff>

<commit_message>
more revisions, update fig five
</commit_message>
<xml_diff>
--- a/revision/review_response.docx
+++ b/revision/review_response.docx
@@ -40,6 +40,38 @@
           <w:i/>
           <w:iCs/>
         </w:rPr>
+        <w:t xml:space="preserve">This is a valid comment and one that we considered during early analyses of the data. As it turns out, the results in the current manuscript our actually from using surface salinity. The text description of averaging by depth was mistakenly included from an earlier draft and we have corrected the text to indicate that only surface salinity was used. Regardless, results using surface salinity vs depth-averaged were very similar and did not make a large difference for model performance. Deviance explained of the GAMs for each bay segment were the same using surface or depth-averaged, the exception being LTB where deviance explained was 0.61 using surface values and 0.59 using depth-averaged. So, there is an improvement in fit using surface values for LTB, but it is marginal.</w:t>
+      </w:r>
+    </w:p>
+    <w:p>
+      <w:pPr>
+        <w:pStyle w:val="BodyText"/>
+      </w:pPr>
+      <w:r>
+        <w:t xml:space="preserve">2. For the</w:t>
+      </w:r>
+      <w:r>
+        <w:t xml:space="preserve"> </w:t>
+      </w:r>
+      <w:r>
+        <w:t xml:space="preserve">“futures”</w:t>
+      </w:r>
+      <w:r>
+        <w:t xml:space="preserve"> </w:t>
+      </w:r>
+      <w:r>
+        <w:t xml:space="preserve">scenario, linear regression is used to empirically estimate future salinity. However, for the loading, it’s more of a sensitivity analysis approach, where the TMDL threshold is either halved or doubled. What is the justification for the choice of loading scenarios, rather than assuming long-term observed trends in loading will continue over the next 50 years? This is obviously unlikely if the decrease in load was due to one-time WWTP upgrades, but I think the choice still warrants further explanation as halving the load specified in the TMDL may also be an equally unlikely scenario depending on source, available BMPs, etc…</w:t>
+      </w:r>
+    </w:p>
+    <w:p>
+      <w:pPr>
+        <w:pStyle w:val="BodyText"/>
+      </w:pPr>
+      <w:r>
+        <w:rPr>
+          <w:i/>
+          <w:iCs/>
+        </w:rPr>
         <w:t xml:space="preserve">response</w:t>
       </w:r>
     </w:p>
@@ -48,19 +80,28 @@
         <w:pStyle w:val="BodyText"/>
       </w:pPr>
       <w:r>
-        <w:t xml:space="preserve">2. For the</w:t>
+        <w:t xml:space="preserve">3. Section 3.2: the value added by the salinity-normalized and salinity-normalized at mean loading is not immediately obvious. For example, lines 379 - 380 state</w:t>
       </w:r>
       <w:r>
         <w:t xml:space="preserve"> </w:t>
       </w:r>
       <w:r>
-        <w:t xml:space="preserve">“futures”</w:t>
+        <w:t xml:space="preserve">“suggesting that salinity and/or loading were key drivers of chlorophyll-a that varied over time”</w:t>
+      </w:r>
+      <w:r>
+        <w:t xml:space="preserve">. Isn’t that already previously inferred from Table 1 and the fact that salinity and interactions between loading and other variables uniquely explain deviance observed in chlorophyll-a? MTB and LTB did not have significant interactions between loading and other variables (Table 1), whereas HB and OTB did, and these are the segments where,</w:t>
       </w:r>
       <w:r>
         <w:t xml:space="preserve"> </w:t>
       </w:r>
       <w:r>
-        <w:t xml:space="preserve">scenario, linear regression is used to empirically estimate future salinity. However, for the loading, it’s more of a sensitivity analysis approach, where the TMDL threshold is either halved or doubled. What is the justification for the choice of loading scenarios, rather than assuming long-term observed trends in loading will continue over the next 50 years? This is obviously unlikely if the decrease in load was due to one-time WWTP upgrades, but I think the choice still warrants further explanation as halving the load specified in the TMDL may also be an equally unlikely scenario depending on source, available BMPs, etc…</w:t>
+        <w:t xml:space="preserve">“salinity-normalized results were similar to those at mean loading. This suggested that loading had more unique effects on chlorophyll-a in OTB and HB, whereas a loading effect could not be distinguished from salinity for MTB and LTB”</w:t>
+      </w:r>
+      <w:r>
+        <w:t xml:space="preserve"> </w:t>
+      </w:r>
+      <w:r>
+        <w:t xml:space="preserve">(lines 383 - 386). The methodological description (section 2.3) and figures for the salinity-normalized results are a bit convoluted, while seemingly redundant of the findings of the original GAM. I think the motivation was to apply a WRTDS-like approach (Beck &amp; Hagy, 2015) within a GAM framework but I’m not convinced that it enhances the findings of the paper.</w:t>
       </w:r>
     </w:p>
     <w:p>
@@ -80,110 +121,170 @@
         <w:pStyle w:val="BodyText"/>
       </w:pPr>
       <w:r>
-        <w:t xml:space="preserve">3. Section 3.2: the value added by the salinity-normalized and salinity-normalized at mean loading is not immediately obvious. For example, lines 379 - 380 state</w:t>
+        <w:t xml:space="preserve">4. Discussion: The relevance of the results regarding future changes in chlorophyll-a are limited by the fact that the authors didn’t consider changes in temperature, which often has a first order effect on algal dynamics. If the salinity-normalized results were removed from the paper, it would allow for the concurrent effects of temperature and salinity to be modeled and discussed, which would strengthen the results/discussion regarding projected changes in chlorophyll-a.</w:t>
+      </w:r>
+    </w:p>
+    <w:p>
+      <w:pPr>
+        <w:pStyle w:val="BodyText"/>
+      </w:pPr>
+      <w:r>
+        <w:rPr>
+          <w:i/>
+          <w:iCs/>
+        </w:rPr>
+        <w:t xml:space="preserve">response</w:t>
+      </w:r>
+    </w:p>
+    <w:p>
+      <w:pPr>
+        <w:pStyle w:val="BodyText"/>
+      </w:pPr>
+      <w:r>
+        <w:t xml:space="preserve">Specific Comments</w:t>
+      </w:r>
+    </w:p>
+    <w:p>
+      <w:pPr>
+        <w:pStyle w:val="BodyText"/>
+      </w:pPr>
+      <w:r>
+        <w:t xml:space="preserve">1. Ln 55: missing period before</w:t>
       </w:r>
       <w:r>
         <w:t xml:space="preserve"> </w:t>
       </w:r>
       <w:r>
-        <w:t xml:space="preserve">“suggesting that salinity and/or loading were key drivers of chlorophyll-a that varied over time”</w:t>
-      </w:r>
-      <w:r>
-        <w:t xml:space="preserve">. Isn’t that already previously inferred from Table 1 and the fact that salinity and interactions between loading and other variables uniquely explain deviance observed in chlorophyll-a? MTB and LTB did not have significant interactions between loading and other variables (Table 1), whereas HB and OTB did, and these are the segments where,</w:t>
+        <w:t xml:space="preserve">“similarly”</w:t>
+      </w:r>
+    </w:p>
+    <w:p>
+      <w:pPr>
+        <w:pStyle w:val="BodyText"/>
+      </w:pPr>
+      <w:r>
+        <w:rPr>
+          <w:i/>
+          <w:iCs/>
+        </w:rPr>
+        <w:t xml:space="preserve">Added.</w:t>
+      </w:r>
+    </w:p>
+    <w:p>
+      <w:pPr>
+        <w:pStyle w:val="BodyText"/>
+      </w:pPr>
+      <w:r>
+        <w:t xml:space="preserve">2. Ln 117: for conciseness consider changing to</w:t>
       </w:r>
       <w:r>
         <w:t xml:space="preserve"> </w:t>
       </w:r>
       <w:r>
-        <w:t xml:space="preserve">“salinity-normalized results were similar to those at mean loading. This suggested that loading had more unique effects on chlorophyll-a in OTB and HB, whereas a loading effect could not be distinguished from salinity for MTB and LTB”</w:t>
-      </w:r>
-      <w:r>
+        <w:t xml:space="preserve">“freshwater inflows and circulation”</w:t>
+      </w:r>
+      <w:r>
+        <w:t xml:space="preserve">.</w:t>
+      </w:r>
+    </w:p>
+    <w:p>
+      <w:pPr>
+        <w:pStyle w:val="BodyText"/>
+      </w:pPr>
+      <w:r>
+        <w:rPr>
+          <w:i/>
+          <w:iCs/>
+        </w:rPr>
+        <w:t xml:space="preserve">Changed.</w:t>
+      </w:r>
+    </w:p>
+    <w:p>
+      <w:pPr>
+        <w:pStyle w:val="BodyText"/>
+      </w:pPr>
+      <w:r>
+        <w:t xml:space="preserve">3. Ln 141: Consider adding bathymetry data to Figure 1 (if available) to accompany description</w:t>
+      </w:r>
+    </w:p>
+    <w:p>
+      <w:pPr>
+        <w:pStyle w:val="BodyText"/>
+      </w:pPr>
+      <w:r>
+        <w:rPr>
+          <w:i/>
+          <w:iCs/>
+        </w:rPr>
+        <w:t xml:space="preserve">Bathymetry was added to the figure, in addition to some legend items to make the elements more readable.</w:t>
+      </w:r>
+    </w:p>
+    <w:p>
+      <w:pPr>
+        <w:pStyle w:val="BodyText"/>
+      </w:pPr>
+      <w:r>
+        <w:t xml:space="preserve">4. Ln 149: Add reference to Figure 2.</w:t>
+      </w:r>
+    </w:p>
+    <w:p>
+      <w:pPr>
+        <w:pStyle w:val="BodyText"/>
+      </w:pPr>
+      <w:r>
+        <w:rPr>
+          <w:i/>
+          <w:iCs/>
+        </w:rPr>
+        <w:t xml:space="preserve">The loading data in Figure 2 begins in 1985 and does not provide a comparison to those from the 1970s</w:t>
+      </w:r>
+      <w:r>
+        <w:rPr>
+          <w:i/>
+          <w:iCs/>
+        </w:rPr>
         <w:t xml:space="preserve"> </w:t>
       </w:r>
       <w:r>
-        <w:t xml:space="preserve">(lines 383 - 386). The methodological description (section 2.3) and figures for the salinity-normalized results are a bit convoluted, while seemingly redundant of the findings of the original GAM. I think the motivation was to apply a WRTDS-like approach (Beck &amp; Hagy, 2015) within a GAM framework but I’m not convinced that it enhances the findings of the paper.</w:t>
-      </w:r>
-    </w:p>
-    <w:p>
-      <w:pPr>
-        <w:pStyle w:val="BodyText"/>
-      </w:pPr>
-      <w:r>
-        <w:rPr>
-          <w:i/>
-          <w:iCs/>
-        </w:rPr>
-        <w:t xml:space="preserve">response</w:t>
-      </w:r>
-    </w:p>
-    <w:p>
-      <w:pPr>
-        <w:pStyle w:val="BodyText"/>
-      </w:pPr>
-      <w:r>
-        <w:t xml:space="preserve">4. Discussion: The relevance of the results regarding future changes in chlorophyll-a are limited by the fact that the authors didn’t consider changes in temperature, which often has a first order effect on algal dynamics. If the salinity-normalized results were removed from the paper, it would allow for the concurrent effects of temperature and salinity to be modeled and discussed, which would strengthen the results/discussion regarding projected changes in chlorophyll-a.</w:t>
-      </w:r>
-    </w:p>
-    <w:p>
-      <w:pPr>
-        <w:pStyle w:val="BodyText"/>
-      </w:pPr>
-      <w:r>
-        <w:rPr>
-          <w:i/>
-          <w:iCs/>
-        </w:rPr>
-        <w:t xml:space="preserve">response</w:t>
-      </w:r>
-    </w:p>
-    <w:p>
-      <w:pPr>
-        <w:pStyle w:val="BodyText"/>
-      </w:pPr>
-      <w:r>
-        <w:t xml:space="preserve">Specific Comments</w:t>
-      </w:r>
-    </w:p>
-    <w:p>
-      <w:pPr>
-        <w:pStyle w:val="BodyText"/>
-      </w:pPr>
-      <w:r>
-        <w:t xml:space="preserve">1. Ln 55: missing period before</w:t>
-      </w:r>
-      <w:r>
+        <w:rPr>
+          <w:i/>
+          <w:iCs/>
+        </w:rPr>
+        <w:t xml:space="preserve">“worst-case”</w:t>
+      </w:r>
+      <w:r>
+        <w:rPr>
+          <w:i/>
+          <w:iCs/>
+        </w:rPr>
         <w:t xml:space="preserve"> </w:t>
       </w:r>
       <w:r>
-        <w:t xml:space="preserve">“similarly”</w:t>
-      </w:r>
-    </w:p>
-    <w:p>
-      <w:pPr>
-        <w:pStyle w:val="BodyText"/>
-      </w:pPr>
-      <w:r>
-        <w:rPr>
-          <w:i/>
-          <w:iCs/>
-        </w:rPr>
-        <w:t xml:space="preserve">Added.</w:t>
-      </w:r>
-    </w:p>
-    <w:p>
-      <w:pPr>
-        <w:pStyle w:val="BodyText"/>
-      </w:pPr>
-      <w:r>
-        <w:t xml:space="preserve">2. Ln 117: for conciseness consider changing to</w:t>
-      </w:r>
-      <w:r>
+        <w:rPr>
+          <w:i/>
+          <w:iCs/>
+        </w:rPr>
+        <w:t xml:space="preserve">scenario. We have added a citation to the historical document from which those estimates were obtained and the current for comparison</w:t>
+      </w:r>
+      <w:r>
+        <w:rPr>
+          <w:i/>
+          <w:iCs/>
+        </w:rPr>
         <w:t xml:space="preserve"> </w:t>
       </w:r>
       <w:r>
-        <w:t xml:space="preserve">“freshwater inflows and circulation”</w:t>
-      </w:r>
-      <w:r>
+        <w:rPr>
+          <w:i/>
+          <w:iCs/>
+        </w:rPr>
+        <w:t xml:space="preserve">(Zarbock et al., 1994; Janicki et al., 2023)</w:t>
+      </w:r>
+      <w:r>
+        <w:rPr>
+          <w:i/>
+          <w:iCs/>
+        </w:rPr>
         <w:t xml:space="preserve">.</w:t>
       </w:r>
     </w:p>
@@ -192,51 +293,39 @@
         <w:pStyle w:val="BodyText"/>
       </w:pPr>
       <w:r>
-        <w:rPr>
-          <w:i/>
-          <w:iCs/>
-        </w:rPr>
-        <w:t xml:space="preserve">Changed.</w:t>
-      </w:r>
-    </w:p>
-    <w:p>
-      <w:pPr>
-        <w:pStyle w:val="BodyText"/>
-      </w:pPr>
-      <w:r>
-        <w:t xml:space="preserve">3. Ln 141: Consider adding bathymetry data to Figure 1 (if available) to accompany description</w:t>
-      </w:r>
-    </w:p>
-    <w:p>
-      <w:pPr>
-        <w:pStyle w:val="BodyText"/>
-      </w:pPr>
-      <w:r>
-        <w:rPr>
-          <w:i/>
-          <w:iCs/>
-        </w:rPr>
-        <w:t xml:space="preserve">Bathymetry was added to the figure, in addition to some legend items to make the elements more readable.</w:t>
-      </w:r>
-    </w:p>
-    <w:p>
-      <w:pPr>
-        <w:pStyle w:val="BodyText"/>
-      </w:pPr>
-      <w:r>
-        <w:t xml:space="preserve">4. Ln 149: Add reference to Figure 2.</w:t>
-      </w:r>
-    </w:p>
-    <w:p>
-      <w:pPr>
-        <w:pStyle w:val="BodyText"/>
-      </w:pPr>
-      <w:r>
-        <w:rPr>
-          <w:i/>
-          <w:iCs/>
-        </w:rPr>
-        <w:t xml:space="preserve">The loading data in Figure 2 begins in 1985 and does not provide a comparison to those from the 1970s</w:t>
+        <w:t xml:space="preserve">5. Consider moving the last paragraph in methods (ln 158 - 175) to the introduction.</w:t>
+      </w:r>
+    </w:p>
+    <w:p>
+      <w:pPr>
+        <w:pStyle w:val="BodyText"/>
+      </w:pPr>
+      <w:r>
+        <w:rPr>
+          <w:i/>
+          <w:iCs/>
+        </w:rPr>
+        <w:t xml:space="preserve">This paragraph was moved to the second to last paragraph of the introduction.</w:t>
+      </w:r>
+    </w:p>
+    <w:p>
+      <w:pPr>
+        <w:pStyle w:val="BodyText"/>
+      </w:pPr>
+      <w:r>
+        <w:t xml:space="preserve">6. Ln 213- 215: Add a citation to show this is a previously documented approach for dealing with long-term change as well as seasonal variability in the time component.</w:t>
+      </w:r>
+    </w:p>
+    <w:p>
+      <w:pPr>
+        <w:pStyle w:val="BodyText"/>
+      </w:pPr>
+      <w:r>
+        <w:rPr>
+          <w:i/>
+          <w:iCs/>
+        </w:rPr>
+        <w:t xml:space="preserve">A citation to</w:t>
       </w:r>
       <w:r>
         <w:rPr>
@@ -250,7 +339,7 @@
           <w:i/>
           <w:iCs/>
         </w:rPr>
-        <w:t xml:space="preserve">“worst-case”</w:t>
+        <w:t xml:space="preserve">Beck et al. (2022)</w:t>
       </w:r>
       <w:r>
         <w:rPr>
@@ -264,7 +353,39 @@
           <w:i/>
           <w:iCs/>
         </w:rPr>
-        <w:t xml:space="preserve">scenario. We have added a citation to the historical document from which those estimates were obtained and the current for comparison</w:t>
+        <w:t xml:space="preserve">was added since this was the origin of the concept.</w:t>
+      </w:r>
+    </w:p>
+    <w:p>
+      <w:pPr>
+        <w:pStyle w:val="BodyText"/>
+      </w:pPr>
+      <w:r>
+        <w:t xml:space="preserve">7. Ln 227 - 229: the justification for assuming a gamma distribution should be elaborated further</w:t>
+      </w:r>
+    </w:p>
+    <w:p>
+      <w:pPr>
+        <w:pStyle w:val="BodyText"/>
+      </w:pPr>
+      <w:r>
+        <w:rPr>
+          <w:i/>
+          <w:iCs/>
+        </w:rPr>
+        <w:t xml:space="preserve">Text was added about justification for the distribution and a table showing a comparison of Gaussian/log-link with the existing Gamma models was included in supplement.</w:t>
+      </w:r>
+    </w:p>
+    <w:p>
+      <w:pPr>
+        <w:pStyle w:val="BodyText"/>
+      </w:pPr>
+      <w:r>
+        <w:rPr>
+          <w:i/>
+          <w:iCs/>
+        </w:rPr>
+        <w:t xml:space="preserve">“Models using a Gaussian distribution with a log-link function were also evaluated, although using a Gamma distribution was superior when compared with Akaike information criterion</w:t>
       </w:r>
       <w:r>
         <w:rPr>
@@ -278,7 +399,48 @@
           <w:i/>
           <w:iCs/>
         </w:rPr>
-        <w:t xml:space="preserve">(Zarbock et al., 1994; Janicki et al., 2023)</w:t>
+        <w:t xml:space="preserve">(Akaike, 1974, Table S1)</w:t>
+      </w:r>
+      <w:r>
+        <w:rPr>
+          <w:i/>
+          <w:iCs/>
+        </w:rPr>
+        <w:t xml:space="preserve">.”</w:t>
+      </w:r>
+    </w:p>
+    <w:p>
+      <w:pPr>
+        <w:pStyle w:val="BodyText"/>
+      </w:pPr>
+      <w:r>
+        <w:t xml:space="preserve">8. Ln 269: minimum and maximum observed over what time-period?</w:t>
+      </w:r>
+    </w:p>
+    <w:p>
+      <w:pPr>
+        <w:pStyle w:val="BodyText"/>
+      </w:pPr>
+      <w:r>
+        <w:rPr>
+          <w:i/>
+          <w:iCs/>
+        </w:rPr>
+        <w:t xml:space="preserve">Text was modified to</w:t>
+      </w:r>
+      <w:r>
+        <w:rPr>
+          <w:i/>
+          <w:iCs/>
+        </w:rPr>
+        <w:t xml:space="preserve"> </w:t>
+      </w:r>
+      <w:r>
+        <w:rPr>
+          <w:i/>
+          <w:iCs/>
+        </w:rPr>
+        <w:t xml:space="preserve">“minimum and maximum observed over the period of record for each bay segment”</w:t>
       </w:r>
       <w:r>
         <w:rPr>
@@ -293,39 +455,39 @@
         <w:pStyle w:val="BodyText"/>
       </w:pPr>
       <w:r>
-        <w:t xml:space="preserve">5. Consider moving the last paragraph in methods (ln 158 - 175) to the introduction.</w:t>
-      </w:r>
-    </w:p>
-    <w:p>
-      <w:pPr>
-        <w:pStyle w:val="BodyText"/>
-      </w:pPr>
-      <w:r>
-        <w:rPr>
-          <w:i/>
-          <w:iCs/>
-        </w:rPr>
-        <w:t xml:space="preserve">This paragraph was moved to the second to last paragraph of the introduction.</w:t>
-      </w:r>
-    </w:p>
-    <w:p>
-      <w:pPr>
-        <w:pStyle w:val="BodyText"/>
-      </w:pPr>
-      <w:r>
-        <w:t xml:space="preserve">6. Ln 213- 215: Add a citation to show this is a previously documented approach for dealing with long-term change as well as seasonal variability in the time component.</w:t>
-      </w:r>
-    </w:p>
-    <w:p>
-      <w:pPr>
-        <w:pStyle w:val="BodyText"/>
-      </w:pPr>
-      <w:r>
-        <w:rPr>
-          <w:i/>
-          <w:iCs/>
-        </w:rPr>
-        <w:t xml:space="preserve">A citation to</w:t>
+        <w:t xml:space="preserve">9. Ln 274: over what time period was the mean loading computed?</w:t>
+      </w:r>
+    </w:p>
+    <w:p>
+      <w:pPr>
+        <w:pStyle w:val="BodyText"/>
+      </w:pPr>
+      <w:r>
+        <w:rPr>
+          <w:i/>
+          <w:iCs/>
+        </w:rPr>
+        <w:t xml:space="preserve">This was also the mean loading for the period of record for each bay segment, similar to salinity. Text was modified similarly as the previous response.</w:t>
+      </w:r>
+    </w:p>
+    <w:p>
+      <w:pPr>
+        <w:pStyle w:val="BodyText"/>
+      </w:pPr>
+      <w:r>
+        <w:t xml:space="preserve">10. Ln 322: Are the chlorophyll-a thresholds defined in FDEP’s water quality standards? It would be helpful to clarify where these numbers come from. Citing Figure 2, which shows the relevant regulatory criteria would likely be sufficient.</w:t>
+      </w:r>
+    </w:p>
+    <w:p>
+      <w:pPr>
+        <w:pStyle w:val="BodyText"/>
+      </w:pPr>
+      <w:r>
+        <w:rPr>
+          <w:i/>
+          <w:iCs/>
+        </w:rPr>
+        <w:t xml:space="preserve">Yes, the chlorophyll-a thresholds are FDEP standards under the bay’s Reasonable Assurance Plan. A citation to Figure 2 was included and</w:t>
       </w:r>
       <w:r>
         <w:rPr>
@@ -339,7 +501,7 @@
           <w:i/>
           <w:iCs/>
         </w:rPr>
-        <w:t xml:space="preserve">Beck et al. (2022)</w:t>
+        <w:t xml:space="preserve">“regulatory”</w:t>
       </w:r>
       <w:r>
         <w:rPr>
@@ -353,39 +515,47 @@
           <w:i/>
           <w:iCs/>
         </w:rPr>
-        <w:t xml:space="preserve">was added since this was the origin of the concept.</w:t>
-      </w:r>
-    </w:p>
-    <w:p>
-      <w:pPr>
-        <w:pStyle w:val="BodyText"/>
-      </w:pPr>
-      <w:r>
-        <w:t xml:space="preserve">7. Ln 227 - 229: the justification for assuming a gamma distribution should be elaborated further</w:t>
-      </w:r>
-    </w:p>
-    <w:p>
-      <w:pPr>
-        <w:pStyle w:val="BodyText"/>
-      </w:pPr>
-      <w:r>
-        <w:rPr>
-          <w:i/>
-          <w:iCs/>
-        </w:rPr>
-        <w:t xml:space="preserve">Text was added about justification for the distribution and a table showing a comparison of Gaussian/log-link with the existing Gamma models was included in supplement.</w:t>
-      </w:r>
-    </w:p>
-    <w:p>
-      <w:pPr>
-        <w:pStyle w:val="BodyText"/>
-      </w:pPr>
-      <w:r>
-        <w:rPr>
-          <w:i/>
-          <w:iCs/>
-        </w:rPr>
-        <w:t xml:space="preserve">“Models using a Gaussian distribution with a log-link function were also evaluated, although using a Gamma distribution was superior when compared with Akaike information criterion</w:t>
+        <w:t xml:space="preserve">was added as a text qualifier for the chlorophyll-a thresholds.</w:t>
+      </w:r>
+    </w:p>
+    <w:p>
+      <w:pPr>
+        <w:pStyle w:val="BodyText"/>
+      </w:pPr>
+      <w:r>
+        <w:t xml:space="preserve">11. Ln 349: Is the lower percent explained in LTB due to aliasing of tidal variability in salinity data since the data was depth-averaged?</w:t>
+      </w:r>
+    </w:p>
+    <w:p>
+      <w:pPr>
+        <w:pStyle w:val="BodyText"/>
+      </w:pPr>
+      <w:r>
+        <w:rPr>
+          <w:i/>
+          <w:iCs/>
+        </w:rPr>
+        <w:t xml:space="preserve">Please see our response to the first general comment.</w:t>
+      </w:r>
+    </w:p>
+    <w:p>
+      <w:pPr>
+        <w:pStyle w:val="BodyText"/>
+      </w:pPr>
+      <w:r>
+        <w:t xml:space="preserve">12. Ln 353 - 356: I believe this is determined by the p-value, which should be clarified in the text.</w:t>
+      </w:r>
+    </w:p>
+    <w:p>
+      <w:pPr>
+        <w:pStyle w:val="BodyText"/>
+      </w:pPr>
+      <w:r>
+        <w:rPr>
+          <w:i/>
+          <w:iCs/>
+        </w:rPr>
+        <w:t xml:space="preserve">Yes, this is correct, although we note that the journal discourages general statements about p-values. We revised the sentence to include more detail about these main effects:</w:t>
       </w:r>
       <w:r>
         <w:rPr>
@@ -399,34 +569,67 @@
           <w:i/>
           <w:iCs/>
         </w:rPr>
-        <w:t xml:space="preserve">(Akaike, 1974, Table S1)</w:t>
-      </w:r>
-      <w:r>
-        <w:rPr>
-          <w:i/>
-          <w:iCs/>
-        </w:rPr>
-        <w:t xml:space="preserve">.”</w:t>
-      </w:r>
-    </w:p>
-    <w:p>
-      <w:pPr>
-        <w:pStyle w:val="BodyText"/>
-      </w:pPr>
-      <w:r>
-        <w:t xml:space="preserve">8. Ln 269: minimum and maximum observed over what time-period?</w:t>
-      </w:r>
-    </w:p>
-    <w:p>
-      <w:pPr>
-        <w:pStyle w:val="BodyText"/>
-      </w:pPr>
-      <w:r>
-        <w:rPr>
-          <w:i/>
-          <w:iCs/>
-        </w:rPr>
-        <w:t xml:space="preserve">Text was modified to</w:t>
+        <w:t xml:space="preserve">“All bay segments had individual smoothers for decimal time, day of year, and salinity that explained a unique portion of the variance in chlorophyll-a (Table 1), although the defined relationships varied from linear (estimated degrees of freedom, edf = 1; e.g., decimal time for OTB, salinity for OTB and HB) to highly non-linear (edf &gt;&gt; 1; day of year for all bay segments).”</w:t>
+      </w:r>
+    </w:p>
+    <w:p>
+      <w:pPr>
+        <w:pStyle w:val="BodyText"/>
+      </w:pPr>
+      <w:r>
+        <w:t xml:space="preserve">13. Ln 365 - 367: Is this because the water column is less stratified? Or because there is less episodic variation in the load, which decreases the likelihood of aliasing higher frequency variability due to storms? In general, some of the trends in model-data agreement across segments are not particularly surprising given the model setup.</w:t>
+      </w:r>
+    </w:p>
+    <w:p>
+      <w:pPr>
+        <w:pStyle w:val="BodyText"/>
+      </w:pPr>
+      <w:r>
+        <w:rPr>
+          <w:i/>
+          <w:iCs/>
+        </w:rPr>
+        <w:t xml:space="preserve">Since stratification does not occur regularly in Tampa Bay, the decreased fit in the wet season is likely due to higher variability in chlorophyll-a and additional factors beyond those included in the model that could influence primary productivity. Conversely, it is very possible that chlorophyll-a during the dry season is captured more fully by the time variables in the model (decimal time, day or year) as other parameters have less of an influence outside of the growing season. We agree, though, that these results are not particularly surprising but it is worth explaining times when the models performed better or worse to help the reader understand factors that could influence chlorophyll-a dynamics.</w:t>
+      </w:r>
+    </w:p>
+    <w:p>
+      <w:pPr>
+        <w:pStyle w:val="BodyText"/>
+      </w:pPr>
+      <w:r>
+        <w:t xml:space="preserve">14. Figure 5: Consider showing the effect plots for the original GAM instead of the salinity-normalized analysis.</w:t>
+      </w:r>
+    </w:p>
+    <w:p>
+      <w:pPr>
+        <w:pStyle w:val="BodyText"/>
+      </w:pPr>
+      <w:r>
+        <w:rPr>
+          <w:i/>
+          <w:iCs/>
+        </w:rPr>
+        <w:t xml:space="preserve">We retain figure 5 because it is central to the second objective of the paper to identify how these models can be used to disambiguate the individual effects of salinity and loading, particularly over time as in the current figures (the effects plots from standard GAM output show the effects across the range of the parameters, not time). However, we have included conventional GAM effects plot for each model in the supplement to help the reader better visualize the smoothers and their interactions (Figures S2 and S3).</w:t>
+      </w:r>
+    </w:p>
+    <w:p>
+      <w:pPr>
+        <w:pStyle w:val="BodyText"/>
+      </w:pPr>
+      <w:r>
+        <w:t xml:space="preserve">15. Figure 6: Consider making the x- and y-axis scales the same for the different segments because the e.g., stronger loading effect in OTB/HB isn’t immediately obvious. Also, are the lines necessary since the points are color-coded? You could instead use a color gradient to represent year as in Figure 3. This would lessen the need to have year labels, which should be described in the caption if included.</w:t>
+      </w:r>
+    </w:p>
+    <w:p>
+      <w:pPr>
+        <w:pStyle w:val="BodyText"/>
+      </w:pPr>
+      <w:r>
+        <w:rPr>
+          <w:i/>
+          <w:iCs/>
+        </w:rPr>
+        <w:t xml:space="preserve">For subfigure (a), we retain the separate scaling for each bay segment because we feel it is important to help visualize differences between years for each bay segment. However, we have removed the path connection between years to help declutter the plot. For subfigure (b), the axes are now fixed to better emphasize scale comparisons between sub-segments. The caption was updated to describe this rationale:</w:t>
       </w:r>
       <w:r>
         <w:rPr>
@@ -440,54 +643,34 @@
           <w:i/>
           <w:iCs/>
         </w:rPr>
-        <w:t xml:space="preserve">“minimum and maximum observed over the period of record for each bay segment”</w:t>
-      </w:r>
-      <w:r>
-        <w:rPr>
-          <w:i/>
-          <w:iCs/>
-        </w:rPr>
-        <w:t xml:space="preserve">.</w:t>
-      </w:r>
-    </w:p>
-    <w:p>
-      <w:pPr>
-        <w:pStyle w:val="BodyText"/>
-      </w:pPr>
-      <w:r>
-        <w:t xml:space="preserve">9. Ln 274: over what time period was the mean loading computed?</w:t>
-      </w:r>
-    </w:p>
-    <w:p>
-      <w:pPr>
-        <w:pStyle w:val="BodyText"/>
-      </w:pPr>
-      <w:r>
-        <w:rPr>
-          <w:i/>
-          <w:iCs/>
-        </w:rPr>
-        <w:t xml:space="preserve">This was also the mean loading for the period of record for each bay segment, similar to salinity. Text was modified similarly as the previous response.</w:t>
-      </w:r>
-    </w:p>
-    <w:p>
-      <w:pPr>
-        <w:pStyle w:val="BodyText"/>
-      </w:pPr>
-      <w:r>
-        <w:t xml:space="preserve">10. Ln 322: Are the chlorophyll-a thresholds defined in FDEP’s water quality standards? It would be helpful to clarify where these numbers come from. Citing Figure 2, which shows the relevant regulatory criteria would likely be sufficient.</w:t>
-      </w:r>
-    </w:p>
-    <w:p>
-      <w:pPr>
-        <w:pStyle w:val="BodyText"/>
-      </w:pPr>
-      <w:r>
-        <w:rPr>
-          <w:i/>
-          <w:iCs/>
-        </w:rPr>
-        <w:t xml:space="preserve">Yes, the chlorophyll-a thresholds are FDEP standards under the bay’s Reasonable Assurance Plan. A citation to Figure 2 was included and</w:t>
+        <w:t xml:space="preserve">“The axis scales are not fixed in (a) to better visualize inter-annual changes within each bay segment, whereas the scales are fixed in (b) to emphasize differences in the magnitude of the drivers between bay segments.”</w:t>
+      </w:r>
+      <w:r>
+        <w:rPr>
+          <w:i/>
+          <w:iCs/>
+        </w:rPr>
+        <w:t xml:space="preserve">. Regarding color, we feel that using these broad annual groupings helps visually discriminate temporal shifts in drivers of chlorophyll (salinity v loading) and the categories align with other comparisons throughout the manuscript (i.e., tables 2 and 3, simulation time period), so they are retained as is.</w:t>
+      </w:r>
+    </w:p>
+    <w:p>
+      <w:pPr>
+        <w:pStyle w:val="BodyText"/>
+      </w:pPr>
+      <w:r>
+        <w:t xml:space="preserve">16. Ln 554-55: Is high salinity attributable to high tidal exchange given the monthly data doesn’t resolve tidal variability? Or is it that the salinity is higher during the dry season? (this explanation seems more consistent with the sentences that follow).</w:t>
+      </w:r>
+    </w:p>
+    <w:p>
+      <w:pPr>
+        <w:pStyle w:val="BodyText"/>
+      </w:pPr>
+      <w:r>
+        <w:rPr>
+          <w:i/>
+          <w:iCs/>
+        </w:rPr>
+        <w:t xml:space="preserve">Yes, this sentence is a little misleading given those that follow. We removed the part about tidal exchange and just shortened the sentence to</w:t>
       </w:r>
       <w:r>
         <w:rPr>
@@ -501,155 +684,14 @@
           <w:i/>
           <w:iCs/>
         </w:rPr>
-        <w:t xml:space="preserve">“regulatory”</w:t>
-      </w:r>
-      <w:r>
-        <w:rPr>
-          <w:i/>
-          <w:iCs/>
-        </w:rPr>
-        <w:t xml:space="preserve"> </w:t>
-      </w:r>
-      <w:r>
-        <w:rPr>
-          <w:i/>
-          <w:iCs/>
-        </w:rPr>
-        <w:t xml:space="preserve">was added as a text qualifier for the chlorophyll-a thresholds.</w:t>
-      </w:r>
-    </w:p>
-    <w:p>
-      <w:pPr>
-        <w:pStyle w:val="BodyText"/>
-      </w:pPr>
-      <w:r>
-        <w:t xml:space="preserve">11. Ln 349: Is the lower percent explained in LTB due to aliasing of tidal variability in salinity data since the data was depth-averaged?</w:t>
-      </w:r>
-    </w:p>
-    <w:p>
-      <w:pPr>
-        <w:pStyle w:val="BodyText"/>
-      </w:pPr>
-      <w:r>
-        <w:rPr>
-          <w:i/>
-          <w:iCs/>
-        </w:rPr>
-        <w:t xml:space="preserve">response</w:t>
-      </w:r>
-    </w:p>
-    <w:p>
-      <w:pPr>
-        <w:pStyle w:val="BodyText"/>
-      </w:pPr>
-      <w:r>
-        <w:t xml:space="preserve">12. Ln 353 - 356: I believe this is determined by the p-value, which should be clarified in the text.</w:t>
-      </w:r>
-    </w:p>
-    <w:p>
-      <w:pPr>
-        <w:pStyle w:val="BodyText"/>
-      </w:pPr>
-      <w:r>
-        <w:rPr>
-          <w:i/>
-          <w:iCs/>
-        </w:rPr>
-        <w:t xml:space="preserve">Yes, this is correct, although we note that the journal discourages general statements about p-values. We revised the sentence to include more detail about these main effects:</w:t>
-      </w:r>
-      <w:r>
-        <w:rPr>
-          <w:i/>
-          <w:iCs/>
-        </w:rPr>
-        <w:t xml:space="preserve"> </w:t>
-      </w:r>
-      <w:r>
-        <w:rPr>
-          <w:i/>
-          <w:iCs/>
-        </w:rPr>
-        <w:t xml:space="preserve">“All bay segments had individual smoothers for decimal time, day of year, and salinity that explained a unique portion of the variance in chlorophyll-a (Table 1), although the defined relationships varied from linear (estimated degrees of freedom, edf = 1; e.g., decimal time for OTB, salinity for OTB and HB) to highly non-linear (edf &gt;&gt; 1; day of year for all bay segments).”</w:t>
-      </w:r>
-    </w:p>
-    <w:p>
-      <w:pPr>
-        <w:pStyle w:val="BodyText"/>
-      </w:pPr>
-      <w:r>
-        <w:t xml:space="preserve">13. Ln 365 - 367: Is this because the water column is less stratified? Or because there is less episodic variation in the load, which decreases the likelihood of aliasing higher frequency variability due to storms? In general, some of the trends in model-data agreement across segments are not particularly surprising given the model setup.</w:t>
-      </w:r>
-    </w:p>
-    <w:p>
-      <w:pPr>
-        <w:pStyle w:val="BodyText"/>
-      </w:pPr>
-      <w:r>
-        <w:rPr>
-          <w:i/>
-          <w:iCs/>
-        </w:rPr>
-        <w:t xml:space="preserve">Since stratification does not occur regularly in Tampa Bay, the decreased fit in the wet season is likely due to higher variability in chlorophyll-a and additional factors beyond those included in the model that could influence primary productivity. Conversely, it is very possible that chlorophyll-a during the dry season is captured more fully by the time variables in the model (decimal time, day or year) as other parameters have less of an influence outside of the growing season. We agree, though, that these results are not particularly surprising but it is worth explaining times when the models performed better or worse to help the reader understand factors that could influence chlorophyll-a dynamics.</w:t>
-      </w:r>
-    </w:p>
-    <w:p>
-      <w:pPr>
-        <w:pStyle w:val="BodyText"/>
-      </w:pPr>
-      <w:r>
-        <w:t xml:space="preserve">14. Figure 5: Consider showing the effect plots for the original GAM instead of the salinity-normalized analysis.</w:t>
-      </w:r>
-    </w:p>
-    <w:p>
-      <w:pPr>
-        <w:pStyle w:val="BodyText"/>
-      </w:pPr>
-      <w:r>
-        <w:rPr>
-          <w:i/>
-          <w:iCs/>
-        </w:rPr>
-        <w:t xml:space="preserve">We retain figure 5 because it is central to the second objective of the paper to identify how these models can be used to disambiguate the individual effects of salinity and loading, particularly over time as in the current figures (the effects plots from standard GAM output show the effects across the range of the parameters, not time). However, we have included conventional GAM effects plot for each model in the supplement to help the reader better visualize the smoothers and their interactions (Figures S2 and S3).</w:t>
-      </w:r>
-    </w:p>
-    <w:p>
-      <w:pPr>
-        <w:pStyle w:val="BodyText"/>
-      </w:pPr>
-      <w:r>
-        <w:t xml:space="preserve">15. Figure 6: Consider making the x- and y-axis scales the same for the different segments because the e.g., stronger loading effect in OTB/HB isn’t immediately obvious. Also, are the lines necessary since the points are color-coded? You could instead use a color gradient to represent year as in Figure 3. This would lessen the need to have year labels, which should be described in the caption if included.</w:t>
-      </w:r>
-    </w:p>
-    <w:p>
-      <w:pPr>
-        <w:pStyle w:val="BodyText"/>
-      </w:pPr>
-      <w:r>
-        <w:rPr>
-          <w:i/>
-          <w:iCs/>
-        </w:rPr>
-        <w:t xml:space="preserve">response</w:t>
-      </w:r>
-    </w:p>
-    <w:p>
-      <w:pPr>
-        <w:pStyle w:val="BodyText"/>
-      </w:pPr>
-      <w:r>
-        <w:t xml:space="preserve">16. Ln 554-55: Is high salinity attributable to high tidal exchange given the monthly data doesn’t resolve tidal variability? Or is it that the salinity is higher during the dry season? (this explanation seems more consistent with the sentences that follow).</w:t>
-      </w:r>
-    </w:p>
-    <w:p>
-      <w:pPr>
-        <w:pStyle w:val="BodyText"/>
-      </w:pPr>
-      <w:r>
-        <w:rPr>
-          <w:i/>
-          <w:iCs/>
-        </w:rPr>
-        <w:t xml:space="preserve">response</w:t>
+        <w:t xml:space="preserve">“The opposite could be true during periods of high salinity (…”</w:t>
+      </w:r>
+      <w:r>
+        <w:rPr>
+          <w:i/>
+          <w:iCs/>
+        </w:rPr>
+        <w:t xml:space="preserve">. As is the premise of this paragraph, the specific causal mechanism for which salinity serves as a proxy cannot be known without additional data. Our interpretation in this paragraph elucidates some potential reasons to allow the reader to make a more informed assessment as to how multiple factors influence phytoplankton growth. Salinity is simply a rough proxy for these drivers, as stated throughout.</w:t>
       </w:r>
     </w:p>
     <w:bookmarkEnd w:id="20"/>

</xml_diff>

<commit_message>
justification for loading scenarios
</commit_message>
<xml_diff>
--- a/revision/review_response.docx
+++ b/revision/review_response.docx
@@ -14,7 +14,7 @@
         <w:t xml:space="preserve">We sincerely thank the editors and all reviewers for providing useful comments on our manuscript. We have made every effort to address these concerns. In particular, we have….. Please see the responses below (line numbers in responses refer to the revised manuscript).</w:t>
       </w:r>
     </w:p>
-    <w:bookmarkStart w:id="20" w:name="reviewer-1"/>
+    <w:bookmarkStart w:id="23" w:name="reviewer-1"/>
     <w:p>
       <w:pPr>
         <w:pStyle w:val="Heading3"/>
@@ -98,35 +98,167 @@
           <w:i/>
           <w:iCs/>
         </w:rPr>
-        <w:t xml:space="preserve">Yes, we agree that the derivation of future loading scenarios doesn’t align conceptually with our future scenarios for salinity. Our target audience for this paper, beyond the typical academic readers, is resource managers and we thought it useful to present the loading scenarios in this general, more coarse context, rather than projected trends. The intent is to motivate action for OTB rather than to demonstrate future scenarios given past trends, i.e., do something now rather than continuing status quo activities that currently contribute to loading that is above the federal threshold. In other words, the</w:t>
-      </w:r>
-      <w:r>
-        <w:rPr>
-          <w:i/>
-          <w:iCs/>
-        </w:rPr>
-        <w:t xml:space="preserve"> </w:t>
-      </w:r>
-      <w:r>
-        <w:rPr>
-          <w:i/>
-          <w:iCs/>
-        </w:rPr>
-        <w:t xml:space="preserve">“do nothing”</w:t>
-      </w:r>
-      <w:r>
-        <w:rPr>
-          <w:i/>
-          <w:iCs/>
-        </w:rPr>
-        <w:t xml:space="preserve"> </w:t>
-      </w:r>
-      <w:r>
-        <w:rPr>
-          <w:i/>
-          <w:iCs/>
-        </w:rPr>
-        <w:t xml:space="preserve">scenario leads to greater risk in the future due to shifting baselines. We also agree that the gross percentage changes (i.e., 50% TMDL, twice/200% the TMDL) may not represent realistic scenarios for the reasons the reviewer mentions. However, we believe are useful as a thought exercise</w:t>
+        <w:t xml:space="preserve">Yes, we agree that the derivation of future loading scenarios doesn’t align conceptually with our future scenarios for salinity. Our target audience for this paper, beyond the typical academic readers, is resource managers and we thought it useful to present the loading scenarios in this general, more coarse context, rather than projected trends (or lack of, see below). The intent is to motivate action for OTB, i.e., do something now rather than continuing status quo activities that currently contribute to loading that is above the federal threshold.</w:t>
+      </w:r>
+    </w:p>
+    <w:p>
+      <w:pPr>
+        <w:pStyle w:val="BodyText"/>
+      </w:pPr>
+      <w:r>
+        <w:rPr>
+          <w:i/>
+          <w:iCs/>
+        </w:rPr>
+        <w:t xml:space="preserve">We also agree that the gross percentage changes (i.e., half TMDL, twice TMDL) may not represent realistic scenarios for the reasons the reviewer mentions. However, we believe these assessments are useful as a thought exercise to put meaningful bounds on how</w:t>
+      </w:r>
+      <w:r>
+        <w:rPr>
+          <w:i/>
+          <w:iCs/>
+        </w:rPr>
+        <w:t xml:space="preserve"> </w:t>
+      </w:r>
+      <w:r>
+        <w:rPr>
+          <w:i/>
+          <w:iCs/>
+        </w:rPr>
+        <w:t xml:space="preserve">“high”</w:t>
+      </w:r>
+      <w:r>
+        <w:rPr>
+          <w:i/>
+          <w:iCs/>
+        </w:rPr>
+        <w:t xml:space="preserve"> </w:t>
+      </w:r>
+      <w:r>
+        <w:rPr>
+          <w:i/>
+          <w:iCs/>
+        </w:rPr>
+        <w:t xml:space="preserve">or</w:t>
+      </w:r>
+      <w:r>
+        <w:rPr>
+          <w:i/>
+          <w:iCs/>
+        </w:rPr>
+        <w:t xml:space="preserve"> </w:t>
+      </w:r>
+      <w:r>
+        <w:rPr>
+          <w:i/>
+          <w:iCs/>
+        </w:rPr>
+        <w:t xml:space="preserve">“low”</w:t>
+      </w:r>
+      <w:r>
+        <w:rPr>
+          <w:i/>
+          <w:iCs/>
+        </w:rPr>
+        <w:t xml:space="preserve"> </w:t>
+      </w:r>
+      <w:r>
+        <w:rPr>
+          <w:i/>
+          <w:iCs/>
+        </w:rPr>
+        <w:t xml:space="preserve">loading scenarios may affect the likelihoods of exceeding thresholds relative to changing salinities. In reality, loading has remained relatively constant for the contemporary period evaluated (2012-2024, although we acknowledge inter-annual variability), thus reinforcing the concept that the status quo may not be sufficient to protect water quality in the future. The figure below shows current loading trends (none of the individual regressions are significant).</w:t>
+      </w:r>
+    </w:p>
+    <w:p>
+      <w:pPr>
+        <w:pStyle w:val="BodyText"/>
+      </w:pPr>
+      <w:r>
+        <w:drawing>
+          <wp:inline>
+            <wp:extent cx="5943600" cy="4245428"/>
+            <wp:effectExtent b="0" l="0" r="0" t="0"/>
+            <wp:docPr descr="" title="" id="21" name="Picture"/>
+            <a:graphic>
+              <a:graphicData uri="http://schemas.openxmlformats.org/drawingml/2006/picture">
+                <pic:pic>
+                  <pic:nvPicPr>
+                    <pic:cNvPr descr="../figs/loadtrends.png" id="22" name="Picture"/>
+                    <pic:cNvPicPr>
+                      <a:picLocks noChangeArrowheads="1" noChangeAspect="1"/>
+                    </pic:cNvPicPr>
+                  </pic:nvPicPr>
+                  <pic:blipFill>
+                    <a:blip r:embed="rId20"/>
+                    <a:stretch>
+                      <a:fillRect/>
+                    </a:stretch>
+                  </pic:blipFill>
+                  <pic:spPr bwMode="auto">
+                    <a:xfrm>
+                      <a:off x="0" y="0"/>
+                      <a:ext cx="5943600" cy="4245428"/>
+                    </a:xfrm>
+                    <a:prstGeom prst="rect">
+                      <a:avLst/>
+                    </a:prstGeom>
+                    <a:noFill/>
+                    <a:ln w="9525">
+                      <a:noFill/>
+                      <a:headEnd/>
+                      <a:tailEnd/>
+                    </a:ln>
+                  </pic:spPr>
+                </pic:pic>
+              </a:graphicData>
+            </a:graphic>
+          </wp:inline>
+        </w:drawing>
+      </w:r>
+    </w:p>
+    <w:p>
+      <w:pPr>
+        <w:pStyle w:val="BodyText"/>
+      </w:pPr>
+      <w:r>
+        <w:rPr>
+          <w:i/>
+          <w:iCs/>
+        </w:rPr>
+        <w:t xml:space="preserve">It’s also worth pointing out that we used long-term salinity trends for the entire period of record (1975 to present) to develop the projections for future salinity. Loading for the same period (1985, when estimates begin) also show a long-term decrease. However, understanding recent loading trends (e.g., 2012 to present) is more relevant in a management context given time frames within which nutrient reduction interventions may infleunce water quality, whereas the long-term reduction in salinity is consistent and cannot be easily modified with conventional management approaches. Thus, our justification for why we are using a contemporary period to assess loading trends (or lack of) and why we are retaining our original loading scenarios is strictly to present results that are better contextualized to how managers may react to changing baselines.</w:t>
+      </w:r>
+    </w:p>
+    <w:p>
+      <w:pPr>
+        <w:pStyle w:val="BodyText"/>
+      </w:pPr>
+      <w:r>
+        <w:rPr>
+          <w:i/>
+          <w:iCs/>
+        </w:rPr>
+        <w:t xml:space="preserve">In brief, we have added the following text to our description of the simulation scenarios:</w:t>
+      </w:r>
+      <w:r>
+        <w:rPr>
+          <w:i/>
+          <w:iCs/>
+        </w:rPr>
+        <w:t xml:space="preserve"> </w:t>
+      </w:r>
+      <w:r>
+        <w:rPr>
+          <w:i/>
+          <w:iCs/>
+        </w:rPr>
+        <w:t xml:space="preserve">“Although long-term reductions in loading have been observed over several decades, evaluating upper and lower bounds of potential loads relative to the TMDL threshold for each bay segment provides a more contextualized assesssment. While we recognize this does not represent a realistic scenario where loading is consistent fifty years into the future, the effects of gradual salinity changes can be more readily evaluated for fixed constants of loading. Moreover, loadings have been relatively consistent for the contemporary period evaluated for the simulations and emphasizing that the”</w:t>
+      </w:r>
+      <w:r>
+        <w:rPr>
+          <w:i/>
+          <w:iCs/>
+        </w:rPr>
+        <w:t xml:space="preserve">status quo” may not remain protective in the future is also a worthwhile assessment.</w:t>
       </w:r>
     </w:p>
     <w:p>
@@ -748,8 +880,8 @@
         <w:t xml:space="preserve">. As is the premise of this paragraph, the specific causal mechanism for which salinity serves as a proxy cannot be known without additional data. Our interpretation in this paragraph elucidates some potential reasons to allow the reader to make a more informed assessment as to how multiple factors influence phytoplankton growth. Salinity is simply a rough proxy for these drivers, as stated throughout.</w:t>
       </w:r>
     </w:p>
-    <w:bookmarkEnd w:id="20"/>
-    <w:bookmarkStart w:id="21" w:name="reviewer-2"/>
+    <w:bookmarkEnd w:id="23"/>
+    <w:bookmarkStart w:id="24" w:name="reviewer-2"/>
     <w:p>
       <w:pPr>
         <w:pStyle w:val="Heading3"/>
@@ -833,8 +965,8 @@
         <w:t xml:space="preserve">response</w:t>
       </w:r>
     </w:p>
-    <w:bookmarkEnd w:id="21"/>
-    <w:bookmarkStart w:id="30" w:name="references"/>
+    <w:bookmarkEnd w:id="24"/>
+    <w:bookmarkStart w:id="33" w:name="references"/>
     <w:p>
       <w:pPr>
         <w:pStyle w:val="Heading2"/>
@@ -843,8 +975,8 @@
         <w:t xml:space="preserve">References</w:t>
       </w:r>
     </w:p>
-    <w:bookmarkStart w:id="29" w:name="refs"/>
-    <w:bookmarkStart w:id="23" w:name="ref-akaike1974"/>
+    <w:bookmarkStart w:id="32" w:name="refs"/>
+    <w:bookmarkStart w:id="26" w:name="ref-akaike1974"/>
     <w:p>
       <w:pPr>
         <w:pStyle w:val="Bibliography"/>
@@ -885,7 +1017,7 @@
       <w:r>
         <w:t xml:space="preserve"> </w:t>
       </w:r>
-      <w:hyperlink r:id="rId22">
+      <w:hyperlink r:id="rId25">
         <w:r>
           <w:rPr>
             <w:rStyle w:val="Hyperlink"/>
@@ -897,8 +1029,8 @@
         <w:t xml:space="preserve">.</w:t>
       </w:r>
     </w:p>
-    <w:bookmarkEnd w:id="23"/>
-    <w:bookmarkStart w:id="25" w:name="ref-beck2022b"/>
+    <w:bookmarkEnd w:id="26"/>
+    <w:bookmarkStart w:id="28" w:name="ref-beck2022b"/>
     <w:p>
       <w:pPr>
         <w:pStyle w:val="Bibliography"/>
@@ -925,7 +1057,7 @@
       <w:r>
         <w:t xml:space="preserve"> </w:t>
       </w:r>
-      <w:hyperlink r:id="rId24">
+      <w:hyperlink r:id="rId27">
         <w:r>
           <w:rPr>
             <w:rStyle w:val="Hyperlink"/>
@@ -937,8 +1069,8 @@
         <w:t xml:space="preserve">.</w:t>
       </w:r>
     </w:p>
-    <w:bookmarkEnd w:id="25"/>
-    <w:bookmarkStart w:id="26" w:name="ref-janicki23"/>
+    <w:bookmarkEnd w:id="28"/>
+    <w:bookmarkStart w:id="29" w:name="ref-janicki23"/>
     <w:p>
       <w:pPr>
         <w:pStyle w:val="Bibliography"/>
@@ -981,8 +1113,8 @@
         <w:t xml:space="preserve">86: 255–263.</w:t>
       </w:r>
     </w:p>
-    <w:bookmarkEnd w:id="26"/>
-    <w:bookmarkStart w:id="28" w:name="ref-tbep0494"/>
+    <w:bookmarkEnd w:id="29"/>
+    <w:bookmarkStart w:id="31" w:name="ref-tbep0494"/>
     <w:p>
       <w:pPr>
         <w:pStyle w:val="Bibliography"/>
@@ -993,7 +1125,7 @@
       <w:r>
         <w:t xml:space="preserve"> </w:t>
       </w:r>
-      <w:hyperlink r:id="rId27">
+      <w:hyperlink r:id="rId30">
         <w:r>
           <w:rPr>
             <w:rStyle w:val="Hyperlink"/>
@@ -1079,9 +1211,9 @@
         <w:t xml:space="preserve">. Technical report 04-94. St. Petersburg, Florida: Tampa Bay Estuary Program.</w:t>
       </w:r>
     </w:p>
-    <w:bookmarkEnd w:id="28"/>
-    <w:bookmarkEnd w:id="29"/>
-    <w:bookmarkEnd w:id="30"/>
+    <w:bookmarkEnd w:id="31"/>
+    <w:bookmarkEnd w:id="32"/>
+    <w:bookmarkEnd w:id="33"/>
     <w:sectPr>
       <w:footerReference r:id="rId9" w:type="default"/>
       <w:pgSz w:h="15840" w:w="12240"/>

</xml_diff>

<commit_message>
review 1 comments addressed
</commit_message>
<xml_diff>
--- a/revision/review_response.docx
+++ b/revision/review_response.docx
@@ -166,7 +166,7 @@
           <w:i/>
           <w:iCs/>
         </w:rPr>
-        <w:t xml:space="preserve">loading scenarios may affect the likelihoods of exceeding thresholds relative to changing salinities. In reality, loading has remained relatively constant for the contemporary period evaluated (2012-2024, although we acknowledge inter-annual variability), thus reinforcing the concept that the status quo may not be sufficient to protect water quality in the future. The figure below shows current loading trends (none of the individual regressions are significant).</w:t>
+        <w:t xml:space="preserve">loading scenarios may affect the likelihoods of exceeding thresholds relative to changing salinities. In reality, loading has remained relatively constant for the contemporary period evaluated (2012-2024, although we acknowledge inter-annual variability), thus reinforcing the concept that the status quo may not be sufficient to protect water quality in the future. The figure below shows current loading trends. None of the individual regressions are significant and we’ve added a supplemental table with these results.</w:t>
       </w:r>
     </w:p>
     <w:p>
@@ -237,21 +237,21 @@
           <w:i/>
           <w:iCs/>
         </w:rPr>
-        <w:t xml:space="preserve">In brief, we have added the following text to our description of the simulation scenarios:</w:t>
-      </w:r>
-      <w:r>
-        <w:rPr>
-          <w:i/>
-          <w:iCs/>
-        </w:rPr>
-        <w:t xml:space="preserve"> </w:t>
-      </w:r>
-      <w:r>
-        <w:rPr>
-          <w:i/>
-          <w:iCs/>
-        </w:rPr>
-        <w:t xml:space="preserve">“Although long-term reductions in loading have been observed over several decades, evaluating upper and lower bounds of potential loads relative to the TMDL threshold for each bay segment provides a more contextualized assesssment. While we recognize this does not represent a realistic scenario where loading is consistent fifty years into the future, the effects of gradual salinity changes can be more readily evaluated for fixed constants of loading. Moreover, loadings have been relatively consistent for the contemporary period evaluated for the simulations and emphasizing that the”</w:t>
+        <w:t xml:space="preserve">In brief, we have added the following text to our description of the simulation scenarios (lines xxx - xxx):</w:t>
+      </w:r>
+      <w:r>
+        <w:rPr>
+          <w:i/>
+          <w:iCs/>
+        </w:rPr>
+        <w:t xml:space="preserve"> </w:t>
+      </w:r>
+      <w:r>
+        <w:rPr>
+          <w:i/>
+          <w:iCs/>
+        </w:rPr>
+        <w:t xml:space="preserve">“Although long-term reductions in loading have been observed over several decades, evaluating upper and lower bounds of potential loads relative to the TMDL threshold for each bay segment provides a more contextualized assesssment. While we recognize this does not represent a realistic scenario where loading is consistent fifty years into the future, the effects of gradual salinity changes can be more readily evaluated for fixed constants of loading. Moreover, loadings have been relatively consistent since 2012 (the simulation period, Table S7) and emphasizing that the”</w:t>
       </w:r>
       <w:r>
         <w:rPr>
@@ -299,7 +299,66 @@
           <w:i/>
           <w:iCs/>
         </w:rPr>
-        <w:t xml:space="preserve">response</w:t>
+        <w:t xml:space="preserve">In general, we feel that it is important to first identify these unique effects before using the models to simulate their effects under potential future conditions. In other words, objective 2 was necessary before we could pursue objective 3. Yes, we agree that there is some redundancy between what the conventional GAM results show (e.g., Table 1) and those in section 3.2, although it is worthwhile to consider the unique information provided by both. Conventional GAM results (Table 1, newly added supplemental figures S2 and S3) only demonstrate that an association exists and how that unique association can be parsed out from the smoothers. Our results in section 3.2 provide a more nuanced interpretation by disaggregating the effects over time. For example, Figure S3 does provide some indication of how loading or salinity effects vary by time (e.g., second and fourth columns showing the bivariate smooths for salinity vs decimal time and loading vs decimal time, respectively), but these do not provide a collective assessment (i.e., the individual smoothers for salinity and loading must also be considered). Our normalized results in Figures 4-6 provide just that.</w:t>
+      </w:r>
+    </w:p>
+    <w:p>
+      <w:pPr>
+        <w:pStyle w:val="BodyText"/>
+      </w:pPr>
+      <w:r>
+        <w:rPr>
+          <w:i/>
+          <w:iCs/>
+        </w:rPr>
+        <w:t xml:space="preserve">To help clarify this distinction, we have added the following text:</w:t>
+      </w:r>
+      <w:r>
+        <w:rPr>
+          <w:i/>
+          <w:iCs/>
+        </w:rPr>
+        <w:t xml:space="preserve"> </w:t>
+      </w:r>
+      <w:r>
+        <w:rPr>
+          <w:i/>
+          <w:iCs/>
+        </w:rPr>
+        <w:t xml:space="preserve">“Although the effects of salinity and loading can be inferred from conventional GAM summaries, either by evaluating tabular model output or from effects plots, they do not provide a holistic interpretation that can be obtained from the normalized results. By utilizing the model predictions that consider the effects of all modeled parameters and normalizing the output as described above, the unique effects of salinity and loading can be more clearly evaluated, especially over time. This approach is essentially a GAM-equivalent to the normalization from other methods</w:t>
+      </w:r>
+      <w:r>
+        <w:rPr>
+          <w:i/>
+          <w:iCs/>
+        </w:rPr>
+        <w:t xml:space="preserve"> </w:t>
+      </w:r>
+      <w:r>
+        <w:rPr>
+          <w:i/>
+          <w:iCs/>
+        </w:rPr>
+        <w:t xml:space="preserve">(e.g., WRTDS, Hirsch et al., 2010; Beck &amp; Hagy, 2015)</w:t>
+      </w:r>
+      <w:r>
+        <w:rPr>
+          <w:i/>
+          <w:iCs/>
+        </w:rPr>
+        <w:t xml:space="preserve">.”</w:t>
+      </w:r>
+    </w:p>
+    <w:p>
+      <w:pPr>
+        <w:pStyle w:val="BodyText"/>
+      </w:pPr>
+      <w:r>
+        <w:rPr>
+          <w:i/>
+          <w:iCs/>
+        </w:rPr>
+        <w:t xml:space="preserve">Figure S1 also demonstrates the normalization process describes in the methods. We have added an inset to panel (c) that provides further clarification on how the normalized results are estimated, with a new note in the text indicating as such.</w:t>
       </w:r>
     </w:p>
     <w:p>
@@ -319,7 +378,49 @@
           <w:i/>
           <w:iCs/>
         </w:rPr>
-        <w:t xml:space="preserve">response</w:t>
+        <w:t xml:space="preserve">This is a completely valid point that is worth considering for future work and this was previously mentioned at the end of the discussion (i.e., lines 603-611). Truthfully, there is a management back-story as to why we focused on salinity, but it is specific to our local challenges and not relevant for this venue. Further, while we recognize temperature increase as a confounding factor that will challenge regulatory attainment in the future, hydrologic circulation and the longer residence times in OTB compared to the other bay segments have been a known issue for decades. Salinity as a proxy for these issues was a direct attempt at addressing this long-standing issue, as well as describing its role along with nutrients in other bay segments. We fully intend on considering temperature changes similarly in future work. The following was added in the final paragraph of the introduction:</w:t>
+      </w:r>
+      <w:r>
+        <w:rPr>
+          <w:i/>
+          <w:iCs/>
+        </w:rPr>
+        <w:t xml:space="preserve"> </w:t>
+      </w:r>
+      <w:r>
+        <w:rPr>
+          <w:i/>
+          <w:iCs/>
+        </w:rPr>
+        <w:t xml:space="preserve">“We focus primarily on salinity and not additional climate change stressors (i.e., temperature) given that Old Tampa Bay (northwest segment) has circulation issues contributing to regulatory exceedances</w:t>
+      </w:r>
+      <w:r>
+        <w:rPr>
+          <w:i/>
+          <w:iCs/>
+        </w:rPr>
+        <w:t xml:space="preserve"> </w:t>
+      </w:r>
+      <w:r>
+        <w:rPr>
+          <w:i/>
+          <w:iCs/>
+        </w:rPr>
+        <w:t xml:space="preserve">(Sherwood et al., 2015; Luther &amp; Meyers, 2022)</w:t>
+      </w:r>
+      <w:r>
+        <w:rPr>
+          <w:i/>
+          <w:iCs/>
+        </w:rPr>
+        <w:t xml:space="preserve"> </w:t>
+      </w:r>
+      <w:r>
+        <w:rPr>
+          <w:i/>
+          <w:iCs/>
+        </w:rPr>
+        <w:t xml:space="preserve">and salinity can serve as a proxy to better understand these effects.”</w:t>
       </w:r>
     </w:p>
     <w:p>
@@ -966,7 +1067,7 @@
       </w:r>
     </w:p>
     <w:bookmarkEnd w:id="24"/>
-    <w:bookmarkStart w:id="33" w:name="references"/>
+    <w:bookmarkStart w:id="41" w:name="references"/>
     <w:p>
       <w:pPr>
         <w:pStyle w:val="Heading2"/>
@@ -975,7 +1076,7 @@
         <w:t xml:space="preserve">References</w:t>
       </w:r>
     </w:p>
-    <w:bookmarkStart w:id="32" w:name="refs"/>
+    <w:bookmarkStart w:id="40" w:name="refs"/>
     <w:bookmarkStart w:id="26" w:name="ref-akaike1974"/>
     <w:p>
       <w:pPr>
@@ -1070,12 +1171,116 @@
       </w:r>
     </w:p>
     <w:bookmarkEnd w:id="28"/>
-    <w:bookmarkStart w:id="29" w:name="ref-janicki23"/>
+    <w:bookmarkStart w:id="30" w:name="ref-beck2015"/>
     <w:p>
       <w:pPr>
         <w:pStyle w:val="Bibliography"/>
       </w:pPr>
       <w:r>
+        <w:t xml:space="preserve">Beck, M. W., and J. D. Hagy. 2015. Adaptation of a weighted regression approach to evaluate water quality trends in an estuary.</w:t>
+      </w:r>
+      <w:r>
+        <w:t xml:space="preserve"> </w:t>
+      </w:r>
+      <w:r>
+        <w:rPr>
+          <w:i/>
+          <w:iCs/>
+        </w:rPr>
+        <w:t xml:space="preserve">Environmental Modeling &amp; Assessment</w:t>
+      </w:r>
+      <w:r>
+        <w:t xml:space="preserve"> </w:t>
+      </w:r>
+      <w:r>
+        <w:t xml:space="preserve">20. Springer: 637–655.</w:t>
+      </w:r>
+      <w:r>
+        <w:t xml:space="preserve"> </w:t>
+      </w:r>
+      <w:hyperlink r:id="rId29">
+        <w:r>
+          <w:rPr>
+            <w:rStyle w:val="Hyperlink"/>
+          </w:rPr>
+          <w:t xml:space="preserve">https://doi.org/10.1007/s10666-015-9452-8</w:t>
+        </w:r>
+      </w:hyperlink>
+      <w:r>
+        <w:t xml:space="preserve">.</w:t>
+      </w:r>
+    </w:p>
+    <w:bookmarkEnd w:id="30"/>
+    <w:bookmarkStart w:id="32" w:name="ref-hirsch2010"/>
+    <w:p>
+      <w:pPr>
+        <w:pStyle w:val="Bibliography"/>
+      </w:pPr>
+      <w:r>
+        <w:t xml:space="preserve">Hirsch, R. M., D. L. Moyer, and S. A. Archfield. 2010. Weighted regressions on time, discharge, and season (</w:t>
+      </w:r>
+      <w:r>
+        <w:t xml:space="preserve">WRTDS</w:t>
+      </w:r>
+      <w:r>
+        <w:t xml:space="preserve">), with an application to</w:t>
+      </w:r>
+      <w:r>
+        <w:t xml:space="preserve"> </w:t>
+      </w:r>
+      <w:r>
+        <w:t xml:space="preserve">C</w:t>
+      </w:r>
+      <w:r>
+        <w:t xml:space="preserve">hesapeake</w:t>
+      </w:r>
+      <w:r>
+        <w:t xml:space="preserve"> </w:t>
+      </w:r>
+      <w:r>
+        <w:t xml:space="preserve">B</w:t>
+      </w:r>
+      <w:r>
+        <w:t xml:space="preserve">ay river inputs 1.</w:t>
+      </w:r>
+      <w:r>
+        <w:t xml:space="preserve"> </w:t>
+      </w:r>
+      <w:r>
+        <w:rPr>
+          <w:i/>
+          <w:iCs/>
+        </w:rPr>
+        <w:t xml:space="preserve">JAWRA Journal of the American Water Resources Association</w:t>
+      </w:r>
+      <w:r>
+        <w:t xml:space="preserve"> </w:t>
+      </w:r>
+      <w:r>
+        <w:t xml:space="preserve">46. Wiley Online Library: 857–880.</w:t>
+      </w:r>
+      <w:r>
+        <w:t xml:space="preserve"> </w:t>
+      </w:r>
+      <w:hyperlink r:id="rId31">
+        <w:r>
+          <w:rPr>
+            <w:rStyle w:val="Hyperlink"/>
+          </w:rPr>
+          <w:t xml:space="preserve">https://doi.org/10.1111/j.1752-1688.2010.00482.x</w:t>
+        </w:r>
+      </w:hyperlink>
+      <w:r>
+        <w:t xml:space="preserve">.</w:t>
+      </w:r>
+    </w:p>
+    <w:bookmarkEnd w:id="32"/>
+    <w:bookmarkStart w:id="33" w:name="ref-janicki23"/>
+    <w:p>
+      <w:pPr>
+        <w:pStyle w:val="Bibliography"/>
+      </w:pPr>
+      <w:r>
         <w:t xml:space="preserve">Janicki, A. J., J. R. Pribble, H. Zarbock, and D. Wade. 2023. A look back at long-term trends in nitrogen loading to</w:t>
       </w:r>
       <w:r>
@@ -1113,19 +1318,215 @@
         <w:t xml:space="preserve">86: 255–263.</w:t>
       </w:r>
     </w:p>
-    <w:bookmarkEnd w:id="29"/>
-    <w:bookmarkStart w:id="31" w:name="ref-tbep0494"/>
+    <w:bookmarkEnd w:id="33"/>
+    <w:bookmarkStart w:id="35" w:name="ref-luther2022"/>
     <w:p>
       <w:pPr>
         <w:pStyle w:val="Bibliography"/>
       </w:pPr>
       <w:r>
+        <w:t xml:space="preserve">Luther, M. E., and S. D. Meyers. 2022.</w:t>
+      </w:r>
+      <w:r>
+        <w:t xml:space="preserve"> </w:t>
+      </w:r>
+      <w:hyperlink r:id="rId34">
+        <w:r>
+          <w:rPr>
+            <w:rStyle w:val="Hyperlink"/>
+            <w:i/>
+            <w:iCs/>
+          </w:rPr>
+          <w:t xml:space="preserve">Designing a genetic algorithm for the selection of causeway cut-throughs in</w:t>
+        </w:r>
+        <w:r>
+          <w:rPr>
+            <w:rStyle w:val="Hyperlink"/>
+            <w:i/>
+            <w:iCs/>
+          </w:rPr>
+          <w:t xml:space="preserve"> </w:t>
+        </w:r>
+        <w:r>
+          <w:rPr>
+            <w:rStyle w:val="Hyperlink"/>
+            <w:i/>
+            <w:iCs/>
+          </w:rPr>
+          <w:t xml:space="preserve">O</w:t>
+        </w:r>
+        <w:r>
+          <w:rPr>
+            <w:rStyle w:val="Hyperlink"/>
+            <w:i/>
+            <w:iCs/>
+          </w:rPr>
+          <w:t xml:space="preserve">ld</w:t>
+        </w:r>
+        <w:r>
+          <w:rPr>
+            <w:rStyle w:val="Hyperlink"/>
+            <w:i/>
+            <w:iCs/>
+          </w:rPr>
+          <w:t xml:space="preserve"> </w:t>
+        </w:r>
+        <w:r>
+          <w:rPr>
+            <w:rStyle w:val="Hyperlink"/>
+            <w:i/>
+            <w:iCs/>
+          </w:rPr>
+          <w:t xml:space="preserve">T</w:t>
+        </w:r>
+        <w:r>
+          <w:rPr>
+            <w:rStyle w:val="Hyperlink"/>
+            <w:i/>
+            <w:iCs/>
+          </w:rPr>
+          <w:t xml:space="preserve">ampa</w:t>
+        </w:r>
+        <w:r>
+          <w:rPr>
+            <w:rStyle w:val="Hyperlink"/>
+            <w:i/>
+            <w:iCs/>
+          </w:rPr>
+          <w:t xml:space="preserve"> </w:t>
+        </w:r>
+        <w:r>
+          <w:rPr>
+            <w:rStyle w:val="Hyperlink"/>
+            <w:i/>
+            <w:iCs/>
+          </w:rPr>
+          <w:t xml:space="preserve">B</w:t>
+        </w:r>
+        <w:r>
+          <w:rPr>
+            <w:rStyle w:val="Hyperlink"/>
+            <w:i/>
+            <w:iCs/>
+          </w:rPr>
+          <w:t xml:space="preserve">ay: Planning and prototyping</w:t>
+        </w:r>
+      </w:hyperlink>
+      <w:r>
+        <w:t xml:space="preserve">. 08-22. St. Petersburg, Florida: Tampa Bay Estuary Program.</w:t>
+      </w:r>
+    </w:p>
+    <w:bookmarkEnd w:id="35"/>
+    <w:bookmarkStart w:id="37" w:name="ref-sherwood2015"/>
+    <w:p>
+      <w:pPr>
+        <w:pStyle w:val="Bibliography"/>
+      </w:pPr>
+      <w:r>
+        <w:t xml:space="preserve">Sherwood, E. T., H. S. Greening, L. Garcia, K. Kaufman, A. J. Janicki, R. Pribble, B. Cunningham, et al. 2015.</w:t>
+      </w:r>
+      <w:r>
+        <w:t xml:space="preserve"> </w:t>
+      </w:r>
+      <w:hyperlink r:id="rId36">
+        <w:r>
+          <w:rPr>
+            <w:rStyle w:val="Hyperlink"/>
+            <w:i/>
+            <w:iCs/>
+          </w:rPr>
+          <w:t xml:space="preserve">Development of an integrated ecosystem model to determine effectiveness of potential watershed management projects on improving</w:t>
+        </w:r>
+        <w:r>
+          <w:rPr>
+            <w:rStyle w:val="Hyperlink"/>
+            <w:i/>
+            <w:iCs/>
+          </w:rPr>
+          <w:t xml:space="preserve"> </w:t>
+        </w:r>
+        <w:r>
+          <w:rPr>
+            <w:rStyle w:val="Hyperlink"/>
+            <w:i/>
+            <w:iCs/>
+          </w:rPr>
+          <w:t xml:space="preserve">O</w:t>
+        </w:r>
+        <w:r>
+          <w:rPr>
+            <w:rStyle w:val="Hyperlink"/>
+            <w:i/>
+            <w:iCs/>
+          </w:rPr>
+          <w:t xml:space="preserve">ld</w:t>
+        </w:r>
+        <w:r>
+          <w:rPr>
+            <w:rStyle w:val="Hyperlink"/>
+            <w:i/>
+            <w:iCs/>
+          </w:rPr>
+          <w:t xml:space="preserve"> </w:t>
+        </w:r>
+        <w:r>
+          <w:rPr>
+            <w:rStyle w:val="Hyperlink"/>
+            <w:i/>
+            <w:iCs/>
+          </w:rPr>
+          <w:t xml:space="preserve">T</w:t>
+        </w:r>
+        <w:r>
+          <w:rPr>
+            <w:rStyle w:val="Hyperlink"/>
+            <w:i/>
+            <w:iCs/>
+          </w:rPr>
+          <w:t xml:space="preserve">ampa</w:t>
+        </w:r>
+        <w:r>
+          <w:rPr>
+            <w:rStyle w:val="Hyperlink"/>
+            <w:i/>
+            <w:iCs/>
+          </w:rPr>
+          <w:t xml:space="preserve"> </w:t>
+        </w:r>
+        <w:r>
+          <w:rPr>
+            <w:rStyle w:val="Hyperlink"/>
+            <w:i/>
+            <w:iCs/>
+          </w:rPr>
+          <w:t xml:space="preserve">B</w:t>
+        </w:r>
+        <w:r>
+          <w:rPr>
+            <w:rStyle w:val="Hyperlink"/>
+            <w:i/>
+            <w:iCs/>
+          </w:rPr>
+          <w:t xml:space="preserve">ay</w:t>
+        </w:r>
+      </w:hyperlink>
+      <w:r>
+        <w:t xml:space="preserve">. 10-15. St. Petersburg, Florida: Tampa Bay Estuary Program.</w:t>
+      </w:r>
+    </w:p>
+    <w:bookmarkEnd w:id="37"/>
+    <w:bookmarkStart w:id="39" w:name="ref-tbep0494"/>
+    <w:p>
+      <w:pPr>
+        <w:pStyle w:val="Bibliography"/>
+      </w:pPr>
+      <w:r>
         <w:t xml:space="preserve">Zarbock, H. W., A. J. Janicki, D. L. Wade, and D. G. Heimbuch. 1994.</w:t>
       </w:r>
       <w:r>
         <w:t xml:space="preserve"> </w:t>
       </w:r>
-      <w:hyperlink r:id="rId30">
+      <w:hyperlink r:id="rId38">
         <w:r>
           <w:rPr>
             <w:rStyle w:val="Hyperlink"/>
@@ -1211,9 +1612,9 @@
         <w:t xml:space="preserve">. Technical report 04-94. St. Petersburg, Florida: Tampa Bay Estuary Program.</w:t>
       </w:r>
     </w:p>
-    <w:bookmarkEnd w:id="31"/>
-    <w:bookmarkEnd w:id="32"/>
-    <w:bookmarkEnd w:id="33"/>
+    <w:bookmarkEnd w:id="39"/>
+    <w:bookmarkEnd w:id="40"/>
+    <w:bookmarkEnd w:id="41"/>
     <w:sectPr>
       <w:footerReference r:id="rId9" w:type="default"/>
       <w:pgSz w:h="15840" w:w="12240"/>

</xml_diff>

<commit_message>
add model comp for select as true, second reviewer issue
</commit_message>
<xml_diff>
--- a/revision/review_response.docx
+++ b/revision/review_response.docx
@@ -251,7 +251,7 @@
           <w:i/>
           <w:iCs/>
         </w:rPr>
-        <w:t xml:space="preserve">“Although long-term reductions in loading have been observed over several decades, evaluating upper and lower bounds of potential loads relative to the TMDL threshold for each bay segment provides a more contextualized assesssment. While we recognize this does not represent a realistic scenario where loading is consistent fifty years into the future, the effects of gradual salinity changes can be more readily evaluated for fixed constants of loading. Moreover, loadings have been relatively consistent since 2012 (the simulation period, Table S7) and emphasizing that the”</w:t>
+        <w:t xml:space="preserve">“Although long-term reductions in loading have been observed over several decades, evaluating upper and lower bounds of potential loads relative to the TMDL threshold for each bay segment provides a more contextualized assesssment. While we recognize this does not represent a realistic scenario where loading is consistent fifty years into the future, the effects of gradual salinity changes can be more readily evaluated for fixed constants of loading. Moreover, loadings have been relatively consistent since 2012 (the simulation period, Table S8) and emphasizing that the”</w:t>
       </w:r>
       <w:r>
         <w:rPr>
@@ -672,21 +672,21 @@
           <w:i/>
           <w:iCs/>
         </w:rPr>
-        <w:t xml:space="preserve">“Models using a Gaussian distribution with a log-link function were also evaluated, although using a Gamma distribution was superior when compared with Akaike information criterion</w:t>
-      </w:r>
-      <w:r>
-        <w:rPr>
-          <w:i/>
-          <w:iCs/>
-        </w:rPr>
-        <w:t xml:space="preserve"> </w:t>
-      </w:r>
-      <w:r>
-        <w:rPr>
-          <w:i/>
-          <w:iCs/>
-        </w:rPr>
-        <w:t xml:space="preserve">(Akaike, 1974, Table S1)</w:t>
+        <w:t xml:space="preserve">“Models using a Gaussian distribution with a log-link function were also evaluated, although using a Gamma distribution was superior when compared with AIC</w:t>
+      </w:r>
+      <w:r>
+        <w:rPr>
+          <w:i/>
+          <w:iCs/>
+        </w:rPr>
+        <w:t xml:space="preserve"> </w:t>
+      </w:r>
+      <w:r>
+        <w:rPr>
+          <w:i/>
+          <w:iCs/>
+        </w:rPr>
+        <w:t xml:space="preserve">(Table S2, Akaike, 1974)</w:t>
       </w:r>
       <w:r>
         <w:rPr>
@@ -1025,49 +1025,453 @@
           <w:i/>
           <w:iCs/>
         </w:rPr>
+        <w:t xml:space="preserve">Thank you for these comments. We preface our response with a brief summary of the changes in response to those from the first reviewer. We have provided justification or further explanation for our decisions on which variables were chosen, including salinity rather than other chlorophyll-a drivers (i.e., temperature) and surface salinity rather than depth-averaged salinity. We also provide justification for the Gamma distribution for model errors. Additional supplementary figures further provide better descriptions of the model output, specifically Figures S2 and S3, which show the effects plots for the individual and bivariate smoothers. These additions improve transparency of the model output to allow the reader to better contextualise the results.</w:t>
+      </w:r>
+    </w:p>
+    <w:p>
+      <w:pPr>
+        <w:pStyle w:val="BodyText"/>
+      </w:pPr>
+      <w:r>
+        <w:rPr>
+          <w:i/>
+          <w:iCs/>
+        </w:rPr>
+        <w:t xml:space="preserve">That being said, none of these additions speak directly to EDA, variable selection, or model structure. The reviewer rightfully points out that we did not sufficiently justify the chosen form of the model. However, our initial analyses did indeed evaluate different forms of the predictors, particularly in how loadings were evaluated (as lags or not) and if model fit could be improved by attempting to remove seasonality or the effects of one predictor within another (i.e., taking the residuals of a fit of loading against salinity to remove the effects of the latter from the former). We also evaluated if constraining the number of knots in the decimal time smoother allowed the variation in chlorophyll to be better explained by the other predictors. The results of these exploratory analyses were already included in supplemental tables. Model fit was not improved using different derivations of the input parameters and smoothing constraints. Our chosen model in equation 1, therefore, represents the results of this initial exploratory analysis as shown in section 2.2.</w:t>
+      </w:r>
+    </w:p>
+    <w:p>
+      <w:pPr>
+        <w:pStyle w:val="BodyText"/>
+      </w:pPr>
+      <w:r>
+        <w:rPr>
+          <w:i/>
+          <w:iCs/>
+        </w:rPr>
+        <w:t xml:space="preserve">What we did not evaluate in our initial exploratory analyses was whether including all variables and smoothers is appropriate. GAM methods in mgcv provide some tools for doing so and we provide some new comparisons to further justify our model form. The same models were fit using the option</w:t>
+      </w:r>
+      <w:r>
+        <w:rPr>
+          <w:i/>
+          <w:iCs/>
+        </w:rPr>
+        <w:t xml:space="preserve"> </w:t>
+      </w:r>
+      <w:r>
+        <w:rPr>
+          <w:rStyle w:val="VerbatimChar"/>
+          <w:i/>
+          <w:iCs/>
+        </w:rPr>
+        <w:t xml:space="preserve">select = T</w:t>
+      </w:r>
+      <w:r>
+        <w:rPr>
+          <w:i/>
+          <w:iCs/>
+        </w:rPr>
+        <w:t xml:space="preserve">. From the</w:t>
+      </w:r>
+      <w:r>
+        <w:rPr>
+          <w:i/>
+          <w:iCs/>
+        </w:rPr>
+        <w:t xml:space="preserve"> </w:t>
+      </w:r>
+      <w:r>
+        <w:rPr>
+          <w:rStyle w:val="VerbatimChar"/>
+          <w:i/>
+          <w:iCs/>
+        </w:rPr>
+        <w:t xml:space="preserve">gam()</w:t>
+      </w:r>
+      <w:r>
+        <w:rPr>
+          <w:i/>
+          <w:iCs/>
+        </w:rPr>
+        <w:t xml:space="preserve"> </w:t>
+      </w:r>
+      <w:r>
+        <w:rPr>
+          <w:i/>
+          <w:iCs/>
+        </w:rPr>
+        <w:t xml:space="preserve">function documentation:</w:t>
+      </w:r>
+      <w:r>
+        <w:rPr>
+          <w:i/>
+          <w:iCs/>
+        </w:rPr>
+        <w:t xml:space="preserve"> </w:t>
+      </w:r>
+      <w:r>
+        <w:rPr>
+          <w:i/>
+          <w:iCs/>
+        </w:rPr>
+        <w:t xml:space="preserve">“If this is TRUE then gam can add an extra penalty to each term so that it can be penalized to zero. This means that the smoothing parameter estimation that is part of fitting can completely remove terms from the model.”</w:t>
+      </w:r>
+      <w:r>
+        <w:rPr>
+          <w:i/>
+          <w:iCs/>
+        </w:rPr>
+        <w:t xml:space="preserve"> </w:t>
+      </w:r>
+      <w:r>
+        <w:rPr>
+          <w:i/>
+          <w:iCs/>
+        </w:rPr>
+        <w:t xml:space="preserve">This is functionally equivalent to parameter selection and allows us to evaluate if the model can be improved by removing any of the predictors or smoothers. The results comparing the full model with those using</w:t>
+      </w:r>
+      <w:r>
+        <w:rPr>
+          <w:i/>
+          <w:iCs/>
+        </w:rPr>
+        <w:t xml:space="preserve"> </w:t>
+      </w:r>
+      <w:r>
+        <w:rPr>
+          <w:rStyle w:val="VerbatimChar"/>
+          <w:i/>
+          <w:iCs/>
+        </w:rPr>
+        <w:t xml:space="preserve">select = T</w:t>
+      </w:r>
+      <w:r>
+        <w:rPr>
+          <w:i/>
+          <w:iCs/>
+        </w:rPr>
+        <w:t xml:space="preserve"> </w:t>
+      </w:r>
+      <w:r>
+        <w:rPr>
+          <w:i/>
+          <w:iCs/>
+        </w:rPr>
+        <w:t xml:space="preserve">are included in supplemental Table S1. The differences are minor, with the largest delta AIC being less than. Functionally, our full models are nearly identical to those where parameter and smoother influences are allowed to be removed if they have negligible effects. Further, using</w:t>
+      </w:r>
+      <w:r>
+        <w:rPr>
+          <w:i/>
+          <w:iCs/>
+        </w:rPr>
+        <w:t xml:space="preserve"> </w:t>
+      </w:r>
+      <w:r>
+        <w:rPr>
+          <w:rStyle w:val="VerbatimChar"/>
+          <w:i/>
+          <w:iCs/>
+        </w:rPr>
+        <w:t xml:space="preserve">method = "REML"</w:t>
+      </w:r>
+      <w:r>
+        <w:rPr>
+          <w:i/>
+          <w:iCs/>
+        </w:rPr>
+        <w:t xml:space="preserve">, as in the original models, is also similar to variable selection by penalizing</w:t>
+      </w:r>
+      <w:r>
+        <w:rPr>
+          <w:i/>
+          <w:iCs/>
+        </w:rPr>
+        <w:t xml:space="preserve"> </w:t>
+      </w:r>
+      <w:r>
+        <w:rPr>
+          <w:i/>
+          <w:iCs/>
+        </w:rPr>
+        <w:t xml:space="preserve">“wiggliness”</w:t>
+      </w:r>
+      <w:r>
+        <w:rPr>
+          <w:i/>
+          <w:iCs/>
+        </w:rPr>
+        <w:t xml:space="preserve"> </w:t>
+      </w:r>
+      <w:r>
+        <w:rPr>
+          <w:i/>
+          <w:iCs/>
+        </w:rPr>
+        <w:t xml:space="preserve">or unnecessary terms, so we feel like our existing approach and this new comparison supports use of our full models.</w:t>
+      </w:r>
+    </w:p>
+    <w:p>
+      <w:pPr>
+        <w:pStyle w:val="BodyText"/>
+      </w:pPr>
+      <w:r>
+        <w:rPr>
+          <w:i/>
+          <w:iCs/>
+        </w:rPr>
+        <w:t xml:space="preserve">The following was added to the methods to further justify the existing models:</w:t>
+      </w:r>
+    </w:p>
+    <w:p>
+      <w:pPr>
+        <w:pStyle w:val="BodyText"/>
+      </w:pPr>
+      <w:r>
+        <w:rPr>
+          <w:i/>
+          <w:iCs/>
+        </w:rPr>
+        <w:t xml:space="preserve">Lines xxx to xxx:</w:t>
+      </w:r>
+      <w:r>
+        <w:rPr>
+          <w:i/>
+          <w:iCs/>
+        </w:rPr>
+        <w:t xml:space="preserve"> </w:t>
+      </w:r>
+      <w:r>
+        <w:rPr>
+          <w:i/>
+          <w:iCs/>
+        </w:rPr>
+        <w:t xml:space="preserve">“Model structure was evaluated using the”</w:t>
+      </w:r>
+      <w:r>
+        <w:rPr>
+          <w:i/>
+          <w:iCs/>
+        </w:rPr>
+        <w:t xml:space="preserve">select” option from the mgcv R package</w:t>
+      </w:r>
+      <w:r>
+        <w:rPr>
+          <w:i/>
+          <w:iCs/>
+        </w:rPr>
+        <w:t xml:space="preserve"> </w:t>
+      </w:r>
+      <w:r>
+        <w:rPr>
+          <w:i/>
+          <w:iCs/>
+        </w:rPr>
+        <w:t xml:space="preserve">(Wood, 2017)</w:t>
+      </w:r>
+      <w:r>
+        <w:rPr>
+          <w:i/>
+          <w:iCs/>
+        </w:rPr>
+        <w:t xml:space="preserve">, which allows the influence of individual smoothers to be removed by penalizing them to zero if they have negligible effects. Comparisons of the full models with those using the select option showed minimal differences</w:t>
+      </w:r>
+      <w:r>
+        <w:rPr>
+          <w:i/>
+          <w:iCs/>
+        </w:rPr>
+        <w:t xml:space="preserve"> </w:t>
+      </w:r>
+      <w:r>
+        <w:rPr>
+          <w:i/>
+          <w:iCs/>
+        </w:rPr>
+        <w:t xml:space="preserve">(Table S1, using differences in Akaike information criterion or AIC,</w:t>
+      </w:r>
+      <w:r>
+        <w:rPr>
+          <w:i/>
+          <w:iCs/>
+        </w:rPr>
+        <w:t xml:space="preserve"> </w:t>
+      </w:r>
+      <m:oMath>
+        <m:r>
+          <m:t>Δ</m:t>
+        </m:r>
+      </m:oMath>
+      <w:r>
+        <w:rPr>
+          <w:i/>
+          <w:iCs/>
+        </w:rPr>
+        <w:t xml:space="preserve">AIC &lt; 3 for all models, Akaike, 1974)</w:t>
+      </w:r>
+      <w:r>
+        <w:rPr>
+          <w:i/>
+          <w:iCs/>
+        </w:rPr>
+        <w:t xml:space="preserve"> </w:t>
+      </w:r>
+      <w:r>
+        <w:rPr>
+          <w:i/>
+          <w:iCs/>
+        </w:rPr>
+        <w:t xml:space="preserve">and the full models are used throughout.”</w:t>
+      </w:r>
+    </w:p>
+    <w:p>
+      <w:pPr>
+        <w:pStyle w:val="BodyText"/>
+      </w:pPr>
+      <w:r>
+        <w:rPr>
+          <w:i/>
+          <w:iCs/>
+        </w:rPr>
+        <w:t xml:space="preserve">Additional description of the REML method was also included:</w:t>
+      </w:r>
+    </w:p>
+    <w:p>
+      <w:pPr>
+        <w:pStyle w:val="BodyText"/>
+      </w:pPr>
+      <w:r>
+        <w:rPr>
+          <w:i/>
+          <w:iCs/>
+        </w:rPr>
+        <w:t xml:space="preserve">Line xxx:</w:t>
+      </w:r>
+      <w:r>
+        <w:rPr>
+          <w:i/>
+          <w:iCs/>
+        </w:rPr>
+        <w:t xml:space="preserve"> </w:t>
+      </w:r>
+      <w:r>
+        <w:rPr>
+          <w:i/>
+          <w:iCs/>
+        </w:rPr>
+        <w:t xml:space="preserve">“Smoothing parameters were estimated using restricted maximum likelihood using the</w:t>
+      </w:r>
+      <w:r>
+        <w:rPr>
+          <w:i/>
+          <w:iCs/>
+        </w:rPr>
+        <w:t xml:space="preserve"> </w:t>
+      </w:r>
+      <w:r>
+        <w:rPr>
+          <w:rStyle w:val="VerbatimChar"/>
+          <w:i/>
+          <w:iCs/>
+        </w:rPr>
+        <w:t xml:space="preserve">gam()</w:t>
+      </w:r>
+      <w:r>
+        <w:rPr>
+          <w:i/>
+          <w:iCs/>
+        </w:rPr>
+        <w:t xml:space="preserve"> </w:t>
+      </w:r>
+      <w:r>
+        <w:rPr>
+          <w:i/>
+          <w:iCs/>
+        </w:rPr>
+        <w:t xml:space="preserve">function from mgcv</w:t>
+      </w:r>
+      <w:r>
+        <w:rPr>
+          <w:i/>
+          <w:iCs/>
+        </w:rPr>
+        <w:t xml:space="preserve"> </w:t>
+      </w:r>
+      <w:r>
+        <w:rPr>
+          <w:i/>
+          <w:iCs/>
+        </w:rPr>
+        <w:t xml:space="preserve">(Wood, 2017)</w:t>
+      </w:r>
+      <w:r>
+        <w:rPr>
+          <w:i/>
+          <w:iCs/>
+        </w:rPr>
+        <w:t xml:space="preserve">, which can further impose constraints by penalizing wiggliness for smoothers that minimally influence the results</w:t>
+      </w:r>
+      <w:r>
+        <w:rPr>
+          <w:i/>
+          <w:iCs/>
+        </w:rPr>
+        <w:t xml:space="preserve"> </w:t>
+      </w:r>
+      <w:r>
+        <w:rPr>
+          <w:i/>
+          <w:iCs/>
+        </w:rPr>
+        <w:t xml:space="preserve">(Wood, 2011)</w:t>
+      </w:r>
+      <w:r>
+        <w:rPr>
+          <w:i/>
+          <w:iCs/>
+        </w:rPr>
+        <w:t xml:space="preserve">.”</w:t>
+      </w:r>
+    </w:p>
+    <w:p>
+      <w:pPr>
+        <w:pStyle w:val="BodyText"/>
+      </w:pPr>
+      <w:r>
+        <w:t xml:space="preserve">Other minor comments are 1) Given the lack of documented EDA, I am not sure about the value of two-time variables. Both are basically taking care of seasonality. The same is true with interaction terms. What are the justifications for those terms? 2) Line 68 to 70 says</w:t>
+      </w:r>
+      <w:r>
+        <w:t xml:space="preserve"> </w:t>
+      </w:r>
+      <w:r>
+        <w:t xml:space="preserve">“This study is an explicit follow-up to Beck et al. (2024) by providing a quantitative assessment of the relative risk of exceeding regulatory standards under future climate change.”</w:t>
+      </w:r>
+      <w:r>
+        <w:t xml:space="preserve"> </w:t>
+      </w:r>
+      <w:r>
+        <w:t xml:space="preserve">I did not see any analysis support for this statement. Please include supporting material or remove it.</w:t>
+      </w:r>
+      <w:r>
+        <w:t xml:space="preserve"> </w:t>
+      </w:r>
+      <w:r>
+        <w:t xml:space="preserve">Overall, this is a great study and could be improved by adding some form of EDA that readers can take away from this study.</w:t>
+      </w:r>
+    </w:p>
+    <w:p>
+      <w:pPr>
+        <w:pStyle w:val="BodyText"/>
+      </w:pPr>
+      <w:r>
+        <w:rPr>
+          <w:i/>
+          <w:iCs/>
+        </w:rPr>
         <w:t xml:space="preserve">response</w:t>
       </w:r>
     </w:p>
-    <w:p>
-      <w:pPr>
-        <w:pStyle w:val="BodyText"/>
-      </w:pPr>
-      <w:r>
-        <w:t xml:space="preserve">Other minor comments are 1) Given the lack of documented EDA, I am not sure about the value of two-time variables. Both are basically taking care of seasonality. The same is true with interaction terms. What are the justifications for those terms? 2) Line 68 to 70 says</w:t>
-      </w:r>
-      <w:r>
-        <w:t xml:space="preserve"> </w:t>
-      </w:r>
-      <w:r>
-        <w:t xml:space="preserve">“This study is an explicit follow-up to Beck et al. (2024) by providing a quantitative assessment of the relative risk of exceeding regulatory standards under future climate change.”</w:t>
-      </w:r>
-      <w:r>
-        <w:t xml:space="preserve"> </w:t>
-      </w:r>
-      <w:r>
-        <w:t xml:space="preserve">I did not see any analysis support for this statement. Please include supporting material or remove it.</w:t>
-      </w:r>
-      <w:r>
-        <w:t xml:space="preserve"> </w:t>
-      </w:r>
-      <w:r>
-        <w:t xml:space="preserve">Overall, this is a great study and could be improved by adding some form of EDA that readers can take away from this study.</w:t>
-      </w:r>
-    </w:p>
-    <w:p>
-      <w:pPr>
-        <w:pStyle w:val="BodyText"/>
-      </w:pPr>
-      <w:r>
-        <w:rPr>
-          <w:i/>
-          <w:iCs/>
-        </w:rPr>
-        <w:t xml:space="preserve">response</w:t>
-      </w:r>
-    </w:p>
     <w:bookmarkEnd w:id="24"/>
-    <w:bookmarkStart w:id="41" w:name="references"/>
+    <w:bookmarkStart w:id="44" w:name="references"/>
     <w:p>
       <w:pPr>
         <w:pStyle w:val="Heading2"/>
@@ -1076,7 +1480,7 @@
         <w:t xml:space="preserve">References</w:t>
       </w:r>
     </w:p>
-    <w:bookmarkStart w:id="40" w:name="refs"/>
+    <w:bookmarkStart w:id="43" w:name="refs"/>
     <w:bookmarkStart w:id="26" w:name="ref-akaike1974"/>
     <w:p>
       <w:pPr>
@@ -1515,18 +1919,137 @@
       </w:r>
     </w:p>
     <w:bookmarkEnd w:id="37"/>
-    <w:bookmarkStart w:id="39" w:name="ref-tbep0494"/>
+    <w:bookmarkStart w:id="39" w:name="ref-wood11"/>
     <w:p>
       <w:pPr>
         <w:pStyle w:val="Bibliography"/>
       </w:pPr>
       <w:r>
+        <w:t xml:space="preserve">Wood, S. N. 2011. Fast stable restricted maximum likelihood and marginal likelihood estimation of semiparametric generalized linear models.</w:t>
+      </w:r>
+      <w:r>
+        <w:t xml:space="preserve"> </w:t>
+      </w:r>
+      <w:r>
+        <w:rPr>
+          <w:i/>
+          <w:iCs/>
+        </w:rPr>
+        <w:t xml:space="preserve">Journal of the Royal Statistical Society (B)</w:t>
+      </w:r>
+      <w:r>
+        <w:t xml:space="preserve"> </w:t>
+      </w:r>
+      <w:r>
+        <w:t xml:space="preserve">73: 3–36.</w:t>
+      </w:r>
+      <w:r>
+        <w:t xml:space="preserve"> </w:t>
+      </w:r>
+      <w:hyperlink r:id="rId38">
+        <w:r>
+          <w:rPr>
+            <w:rStyle w:val="Hyperlink"/>
+          </w:rPr>
+          <w:t xml:space="preserve">https://doi.org/10.1111/j.1467-9868.2010.00749.x</w:t>
+        </w:r>
+      </w:hyperlink>
+      <w:r>
+        <w:t xml:space="preserve">.</w:t>
+      </w:r>
+    </w:p>
+    <w:bookmarkEnd w:id="39"/>
+    <w:bookmarkStart w:id="40" w:name="ref-wood17"/>
+    <w:p>
+      <w:pPr>
+        <w:pStyle w:val="Bibliography"/>
+      </w:pPr>
+      <w:r>
+        <w:t xml:space="preserve">Wood, S. N. 2017.</w:t>
+      </w:r>
+      <w:r>
+        <w:t xml:space="preserve"> </w:t>
+      </w:r>
+      <w:r>
+        <w:rPr>
+          <w:i/>
+          <w:iCs/>
+        </w:rPr>
+        <w:t xml:space="preserve">Generalized</w:t>
+      </w:r>
+      <w:r>
+        <w:rPr>
+          <w:i/>
+          <w:iCs/>
+        </w:rPr>
+        <w:t xml:space="preserve"> </w:t>
+      </w:r>
+      <w:r>
+        <w:rPr>
+          <w:i/>
+          <w:iCs/>
+        </w:rPr>
+        <w:t xml:space="preserve">A</w:t>
+      </w:r>
+      <w:r>
+        <w:rPr>
+          <w:i/>
+          <w:iCs/>
+        </w:rPr>
+        <w:t xml:space="preserve">dditive</w:t>
+      </w:r>
+      <w:r>
+        <w:rPr>
+          <w:i/>
+          <w:iCs/>
+        </w:rPr>
+        <w:t xml:space="preserve"> </w:t>
+      </w:r>
+      <w:r>
+        <w:rPr>
+          <w:i/>
+          <w:iCs/>
+        </w:rPr>
+        <w:t xml:space="preserve">M</w:t>
+      </w:r>
+      <w:r>
+        <w:rPr>
+          <w:i/>
+          <w:iCs/>
+        </w:rPr>
+        <w:t xml:space="preserve">odels: An introduction with</w:t>
+      </w:r>
+      <w:r>
+        <w:rPr>
+          <w:i/>
+          <w:iCs/>
+        </w:rPr>
+        <w:t xml:space="preserve"> </w:t>
+      </w:r>
+      <w:r>
+        <w:rPr>
+          <w:i/>
+          <w:iCs/>
+        </w:rPr>
+        <w:t xml:space="preserve">R</w:t>
+      </w:r>
+      <w:r>
+        <w:t xml:space="preserve">. 2nd ed. Chapman; Hall/CRC.</w:t>
+      </w:r>
+    </w:p>
+    <w:bookmarkEnd w:id="40"/>
+    <w:bookmarkStart w:id="42" w:name="ref-tbep0494"/>
+    <w:p>
+      <w:pPr>
+        <w:pStyle w:val="Bibliography"/>
+      </w:pPr>
+      <w:r>
         <w:t xml:space="preserve">Zarbock, H. W., A. J. Janicki, D. L. Wade, and D. G. Heimbuch. 1994.</w:t>
       </w:r>
       <w:r>
         <w:t xml:space="preserve"> </w:t>
       </w:r>
-      <w:hyperlink r:id="rId38">
+      <w:hyperlink r:id="rId41">
         <w:r>
           <w:rPr>
             <w:rStyle w:val="Hyperlink"/>
@@ -1612,9 +2135,9 @@
         <w:t xml:space="preserve">. Technical report 04-94. St. Petersburg, Florida: Tampa Bay Estuary Program.</w:t>
       </w:r>
     </w:p>
-    <w:bookmarkEnd w:id="39"/>
-    <w:bookmarkEnd w:id="40"/>
-    <w:bookmarkEnd w:id="41"/>
+    <w:bookmarkEnd w:id="42"/>
+    <w:bookmarkEnd w:id="43"/>
+    <w:bookmarkEnd w:id="44"/>
     <w:sectPr>
       <w:footerReference r:id="rId9" w:type="default"/>
       <w:pgSz w:h="15840" w:w="12240"/>

</xml_diff>

<commit_message>
add ETS, RM, QZ edits to revision
</commit_message>
<xml_diff>
--- a/revision/review_response.docx
+++ b/revision/review_response.docx
@@ -11,7 +11,7 @@
           <w:i/>
           <w:iCs/>
         </w:rPr>
-        <w:t xml:space="preserve">We sincerely thank the reviewers for providing useful comments on our manuscript. We have made every effort to address these concerns. Please see the responses below. Line numbers in responses refer to the revised manuscript and those from reviewers are from the original manuscript.</w:t>
+        <w:t xml:space="preserve">We sincerely thank the reviewers for providing useful comments on our manuscript. We greatly appreciate the time and effort invested in reviewing our work. We have carefully considered each comment and have revised the manuscript accordingly. Please see the responses below. Line numbers in responses refer to the revised manuscript and those from reviewers are from the original manuscript.</w:t>
       </w:r>
     </w:p>
     <w:bookmarkStart w:id="23" w:name="reviewer-1"/>
@@ -40,19 +40,99 @@
           <w:i/>
           <w:iCs/>
         </w:rPr>
-        <w:t xml:space="preserve">This is a valid comment and one that we considered during early analyses of the data. As it turns out, the results in the current manuscript actually use surface salinity. The text description of averaging by depth was mistakenly included from an earlier draft and we have corrected the text to indicate that only surface salinity was used. Regardless, results using surface salinity vs depth-averaged were very similar and did not make a large difference for model performance. Deviance explained of the GAMs for each bay segment were the same using surface or depth-averaged, the exception being LTB where deviance explained was 0.61 using surface values and 0.59 using depth-averaged. So, there is an improvement in fit using surface values for LTB, but it is marginal.</w:t>
-      </w:r>
-    </w:p>
-    <w:p>
-      <w:pPr>
-        <w:pStyle w:val="BodyText"/>
-      </w:pPr>
-      <w:r>
-        <w:rPr>
-          <w:i/>
-          <w:iCs/>
-        </w:rPr>
-        <w:t xml:space="preserve">The following was added for additional context (lines 181-188):</w:t>
+        <w:t xml:space="preserve">This is a valid comment and one that we considered during early analyses of the data. Importantly, the results presented in the current manuscript were actually derived using surface salinity. The text description of averaging by depth was mistakenly included from an earlier draft and we have corrected the text to indicate that only surface salinity was used. Regardless, results obtained using surface salinity vs depth-averaged were very similar and did not make a large difference for model performance. Further, chlorophyll-a samples have historically been collected at mid-depth at each site, and salinity stratification is considered relatively minor in the shallow, partially to well-mixed estuary</w:t>
+      </w:r>
+      <w:r>
+        <w:rPr>
+          <w:i/>
+          <w:iCs/>
+        </w:rPr>
+        <w:t xml:space="preserve"> </w:t>
+      </w:r>
+      <w:r>
+        <w:rPr>
+          <w:i/>
+          <w:iCs/>
+        </w:rPr>
+        <w:t xml:space="preserve">(Chen et al., 2019)</w:t>
+      </w:r>
+      <w:r>
+        <w:rPr>
+          <w:i/>
+          <w:iCs/>
+        </w:rPr>
+        <w:t xml:space="preserve">. Deviance explained of the GAMs for each bay segment were the same using surface or depth-averaged, the exception being LTB where deviance explained was 0.61 using surface values and 0.59 using depth-averaged. Thus, although surface salinity resulted in a marginal improvement in model fit for LTB, the overall conclusions remain unchanged.</w:t>
+      </w:r>
+    </w:p>
+    <w:p>
+      <w:pPr>
+        <w:pStyle w:val="BodyText"/>
+      </w:pPr>
+      <w:r>
+        <w:rPr>
+          <w:i/>
+          <w:iCs/>
+        </w:rPr>
+        <w:t xml:space="preserve">The following was added for additional context:</w:t>
+      </w:r>
+    </w:p>
+    <w:p>
+      <w:pPr>
+        <w:pStyle w:val="BodyText"/>
+      </w:pPr>
+      <w:r>
+        <w:rPr>
+          <w:i/>
+          <w:iCs/>
+        </w:rPr>
+        <w:t xml:space="preserve">Lines 146-148:</w:t>
+      </w:r>
+      <w:r>
+        <w:rPr>
+          <w:i/>
+          <w:iCs/>
+        </w:rPr>
+        <w:t xml:space="preserve"> </w:t>
+      </w:r>
+      <w:r>
+        <w:rPr>
+          <w:i/>
+          <w:iCs/>
+        </w:rPr>
+        <w:t xml:space="preserve">“The water column is partially to well-mixed and does not exhibit strong stratification</w:t>
+      </w:r>
+      <w:r>
+        <w:rPr>
+          <w:i/>
+          <w:iCs/>
+        </w:rPr>
+        <w:t xml:space="preserve"> </w:t>
+      </w:r>
+      <w:r>
+        <w:rPr>
+          <w:i/>
+          <w:iCs/>
+        </w:rPr>
+        <w:t xml:space="preserve">(Chen et al., 2019)</w:t>
+      </w:r>
+      <w:r>
+        <w:rPr>
+          <w:i/>
+          <w:iCs/>
+        </w:rPr>
+        <w:t xml:space="preserve">.”</w:t>
+      </w:r>
+    </w:p>
+    <w:p>
+      <w:pPr>
+        <w:pStyle w:val="BodyText"/>
+      </w:pPr>
+      <w:r>
+        <w:rPr>
+          <w:i/>
+          <w:iCs/>
+        </w:rPr>
+        <w:t xml:space="preserve">Lines 183-190:</w:t>
       </w:r>
       <w:r>
         <w:rPr>
@@ -98,75 +178,19 @@
           <w:i/>
           <w:iCs/>
         </w:rPr>
-        <w:t xml:space="preserve">Yes, we agree that the derivation of future loading scenarios doesn’t align conceptually with our future scenarios for salinity. Our target audience for this paper, beyond the typical academic readers, is resource managers and we thought it useful to present the loading scenarios in this general, more coarse context, rather than projected trends (or lack of, see below). The intent is to motivate action for OTB, i.e., do something now rather than continuing status quo activities that currently contribute to loading that is above the federal threshold.</w:t>
-      </w:r>
-    </w:p>
-    <w:p>
-      <w:pPr>
-        <w:pStyle w:val="BodyText"/>
-      </w:pPr>
-      <w:r>
-        <w:rPr>
-          <w:i/>
-          <w:iCs/>
-        </w:rPr>
-        <w:t xml:space="preserve">We also agree that the gross percentage changes (i.e., half TMDL, twice TMDL) may not represent realistic scenarios for the reasons the reviewer mentions. However, we believe these assessments are useful as a thought exercise to put meaningful bounds on how</w:t>
-      </w:r>
-      <w:r>
-        <w:rPr>
-          <w:i/>
-          <w:iCs/>
-        </w:rPr>
-        <w:t xml:space="preserve"> </w:t>
-      </w:r>
-      <w:r>
-        <w:rPr>
-          <w:i/>
-          <w:iCs/>
-        </w:rPr>
-        <w:t xml:space="preserve">“high”</w:t>
-      </w:r>
-      <w:r>
-        <w:rPr>
-          <w:i/>
-          <w:iCs/>
-        </w:rPr>
-        <w:t xml:space="preserve"> </w:t>
-      </w:r>
-      <w:r>
-        <w:rPr>
-          <w:i/>
-          <w:iCs/>
-        </w:rPr>
-        <w:t xml:space="preserve">or</w:t>
-      </w:r>
-      <w:r>
-        <w:rPr>
-          <w:i/>
-          <w:iCs/>
-        </w:rPr>
-        <w:t xml:space="preserve"> </w:t>
-      </w:r>
-      <w:r>
-        <w:rPr>
-          <w:i/>
-          <w:iCs/>
-        </w:rPr>
-        <w:t xml:space="preserve">“low”</w:t>
-      </w:r>
-      <w:r>
-        <w:rPr>
-          <w:i/>
-          <w:iCs/>
-        </w:rPr>
-        <w:t xml:space="preserve"> </w:t>
-      </w:r>
-      <w:r>
-        <w:rPr>
-          <w:i/>
-          <w:iCs/>
-        </w:rPr>
-        <w:t xml:space="preserve">loading scenarios may affect the likelihoods of exceeding thresholds relative to changing salinities. In reality, loading has remained relatively constant for the contemporary period evaluated (2012-2024, although we acknowledge inter-annual variability), thus reinforcing the concept that the status quo may not be sufficient to protect water quality in the future. The figure below shows current loading trends. None of the individual regressions are significant and we’ve added a supplemental table with these results (Table S8).</w:t>
+        <w:t xml:space="preserve">Yes, we agree that the derivation of future loading scenarios doesn’t align conceptually with our future scenarios for salinity. Our target audience for this paper, beyond the typical academic readers, is resource managers and we thought it useful to present the loading scenarios in this general, more coarse context, rather than projected trends (or lack of, see below). The primary objective was to evaluate the potential consequences of management action (or inaction) under changing environmental baselines, particularly in OTB, where current loading remains above the regulatory threshold.</w:t>
+      </w:r>
+    </w:p>
+    <w:p>
+      <w:pPr>
+        <w:pStyle w:val="BodyText"/>
+      </w:pPr>
+      <w:r>
+        <w:rPr>
+          <w:i/>
+          <w:iCs/>
+        </w:rPr>
+        <w:t xml:space="preserve">We also agree that the gross percentage changes (i.e., half TMDL, twice TMDL) may not represent realistic scenarios for the reasons the reviewer mentions. However, we believe these scenarios provide useful upper and lower bounds that help illustrate how substantial changes in nutrient loadings may affect the likelihoods of exceeding thresholds relative to changing salinities. In reality, nutrient loading has remained relatively stable during the contemporary period evaluated (2012-2024), despite interannual variability. This observation reinforces the possibility that maintaining current loading levels may not be sufficient to protect water quality in the future. The figure below shows current loading trends. None of the individual regressions are significant and we’ve added a supplemental table with these results (Table S8).</w:t>
       </w:r>
     </w:p>
     <w:p>
@@ -225,19 +249,19 @@
           <w:i/>
           <w:iCs/>
         </w:rPr>
-        <w:t xml:space="preserve">It’s also worth pointing out that we used long-term salinity trends for the entire period of record (1975 to present) to develop the projections for future salinity. Loading for the same period (1985, when estimates begin) also show a long-term decrease. However, understanding recent loading trends (e.g., 2012 to present) is more relevant in a management context given time frames within which nutrient reduction interventions may influence water quality, whereas the long-term reduction in salinity is consistent and cannot be easily modified with conventional management approaches. Thus, our justification for why we are using a contemporary period to evaluate loading changes and why we are retaining our original loading scenarios is strictly to present results that are better contextualized to how managers may react to changing baselines.</w:t>
-      </w:r>
-    </w:p>
-    <w:p>
-      <w:pPr>
-        <w:pStyle w:val="BodyText"/>
-      </w:pPr>
-      <w:r>
-        <w:rPr>
-          <w:i/>
-          <w:iCs/>
-        </w:rPr>
-        <w:t xml:space="preserve">In brief, we have added the following text to our description of the simulation scenarios (lines 365-372):</w:t>
+        <w:t xml:space="preserve">It’s also worth pointing out that we used long-term salinity trends for the entire period of record (1975 to present) to develop the projections for future salinity. Loading for the same period (1985, when estimates begin) also show a long-term decrease. However, understanding recent loading trends (e.g., 2012 to present) is more relevant in a management context given the time frames within which nutrient reduction interventions may influence water quality, whereas the long-term reduction in salinity is consistent and cannot be easily modified with conventional management approaches. Thus, our justification for why we are using a contemporary period to evaluate loading changes and why we are retaining our original loading scenarios is strictly to present results to resource managers and permit holders under changing baselines.</w:t>
+      </w:r>
+    </w:p>
+    <w:p>
+      <w:pPr>
+        <w:pStyle w:val="BodyText"/>
+      </w:pPr>
+      <w:r>
+        <w:rPr>
+          <w:i/>
+          <w:iCs/>
+        </w:rPr>
+        <w:t xml:space="preserve">In brief, we have added the following text to our description of the simulation scenarios (lines 368-375):</w:t>
       </w:r>
       <w:r>
         <w:rPr>
@@ -292,19 +316,19 @@
           <w:i/>
           <w:iCs/>
         </w:rPr>
-        <w:t xml:space="preserve">In general, we feel that it is important to first characterize these unique effects before using the models to simulate their effects under potential future conditions. In other words, objective 2 was necessary before we could pursue objective 3. Yes, we agree that there is some redundancy between what the conventional GAM results show (e.g., Table 1) and those in section 3.2, although it is worthwhile to consider the unique information provided by both. Conventional GAM results (Table 1, newly added supplemental figures S2 and S3) only demonstrate that an association exists and how that unique association can be parsed out from the smoothers. Our results in section 3.2 provide a more nuanced interpretation by disaggregating the effects over time. For example, Figure S3 provides some indication of how loading or salinity effects vary by time (e.g., second and fourth columns showing the bivariate smooths for salinity vs decimal time and loading vs decimal time, respectively). However, these effects plots do not provide a collective assessment in that the individual smoothers for salinity and loading must also be considered. Our normalized results in Figures 4-6 provide that information.</w:t>
-      </w:r>
-    </w:p>
-    <w:p>
-      <w:pPr>
-        <w:pStyle w:val="BodyText"/>
-      </w:pPr>
-      <w:r>
-        <w:rPr>
-          <w:i/>
-          <w:iCs/>
-        </w:rPr>
-        <w:t xml:space="preserve">To help clarify this distinction, we have added the following text (lines 297-303):</w:t>
+        <w:t xml:space="preserve">We appreciate this perspective. Our rationale for including the normalization analyses was that understanding the independent effects of salinity and loading is a necessary prerequisite for evaluating their potential impacts under future conditions. In other words, objective 2 was necessary before we could pursue objective 3. We agree that there is some overlap between the information provided by the conventional GAM summaries and the normalized analyses. However, the two approaches provide complementary insights. Conventional GAM results (Table 1, newly added supplemental figures S2 and S3) only demonstrate that an association exists and how that unique association can be parsed out from the smoothers. Our results in section 3.2 provide a more nuanced interpretation by disaggregating the effects over time. For example, Figure S3 provides some indication of how loading or salinity effects vary by time (e.g., second and fourth columns showing the bivariate smooths for salinity vs decimal time and loading vs decimal time, respectively). However, these effects plots do not provide a collective assessment in that the individual smoothers for salinity and loading must also be considered. Figures 4-6 therefore provide a temporal interpretation that cannot be readily obtained from conventional GAM effects plots alone.</w:t>
+      </w:r>
+    </w:p>
+    <w:p>
+      <w:pPr>
+        <w:pStyle w:val="BodyText"/>
+      </w:pPr>
+      <w:r>
+        <w:rPr>
+          <w:i/>
+          <w:iCs/>
+        </w:rPr>
+        <w:t xml:space="preserve">To help clarify this distinction, we have added the following text (lines 299-305):</w:t>
       </w:r>
       <w:r>
         <w:rPr>
@@ -351,7 +375,7 @@
           <w:i/>
           <w:iCs/>
         </w:rPr>
-        <w:t xml:space="preserve">Figure S1 also demonstrates the normalization process describes in the methods. We have added an inset to panel (c) that provides further clarification on how the normalized results are estimated, with a new note in the text indicating as such (line 319).</w:t>
+        <w:t xml:space="preserve">Figure S1 also demonstrates the normalization process described in the methods. We have added an inset to panel (c) that provides further clarification on how the normalized results are estimated, with a new note in the text indicating as such (line 321).</w:t>
       </w:r>
     </w:p>
     <w:p>
@@ -371,33 +395,33 @@
           <w:i/>
           <w:iCs/>
         </w:rPr>
-        <w:t xml:space="preserve">This is a completely valid point that is worth considering for future work and this was previously mentioned at the end of the discussion (i.e., lines 637-640). Truthfully, there is a management back-story as to why we focused on salinity, but it is specific to our local challenges and not relevant for this venue. Further, while we recognize temperature increase as a confounding factor that will challenge regulatory attainment in the future, hydrologic circulation and the longer residence times in OTB compared to the other bay segments have been a known issue for decades. Salinity as a proxy was a direct attempt at better understanding these long-standing issues, as well as describing its role along with nutrients in other bay segments. We fully intend on considering temperature changes similarly in future work.</w:t>
-      </w:r>
-    </w:p>
-    <w:p>
-      <w:pPr>
-        <w:pStyle w:val="BodyText"/>
-      </w:pPr>
-      <w:r>
-        <w:rPr>
-          <w:i/>
-          <w:iCs/>
-        </w:rPr>
-        <w:t xml:space="preserve">The following was added in the final paragraph of the introduction (lines 134-137):</w:t>
-      </w:r>
-      <w:r>
-        <w:rPr>
-          <w:i/>
-          <w:iCs/>
-        </w:rPr>
-        <w:t xml:space="preserve"> </w:t>
-      </w:r>
-      <w:r>
-        <w:rPr>
-          <w:i/>
-          <w:iCs/>
-        </w:rPr>
-        <w:t xml:space="preserve">“We focus primarily on salinity and not additional climate change stressors (i.e., temperature) given that Old Tampa Bay (northwest segment) has circulation issues contributing to regulatory exceedances</w:t>
+        <w:t xml:space="preserve">We agree that temperature is an important driver of phytoplankton dynamics and that its inclusion could improve future projections of chlorophyll-a. This limitation was previously acknowledged in the Discussion (i.e., lines 639-642) and has now been highlighted more explicitly in both the Introduction and Discussion. Our decision to focus on salinity was motivated by longstanding management concerns regarding circulation dynamics and residence times in Old Tampa Bay, which have been linked to historical regulatory exceedances. Salinity serves as a useful proxy for these hydrodynamic influences and therefore provided a direct means of evaluating their relationship with chlorophyll-a. Future studies that jointly evaluate salinity, temperature, and nutrient loading would provide a more comprehensive assessment of how multiple climate-related stressors may influence chlorophyll-a dynamics and regulatory attainment.</w:t>
+      </w:r>
+    </w:p>
+    <w:p>
+      <w:pPr>
+        <w:pStyle w:val="BodyText"/>
+      </w:pPr>
+      <w:r>
+        <w:rPr>
+          <w:i/>
+          <w:iCs/>
+        </w:rPr>
+        <w:t xml:space="preserve">The following was added in the final paragraph of the introduction (lines 134-138):</w:t>
+      </w:r>
+      <w:r>
+        <w:rPr>
+          <w:i/>
+          <w:iCs/>
+        </w:rPr>
+        <w:t xml:space="preserve"> </w:t>
+      </w:r>
+      <w:r>
+        <w:rPr>
+          <w:i/>
+          <w:iCs/>
+        </w:rPr>
+        <w:t xml:space="preserve">“We focus primarily on salinity and not additional climate change stressors (i.e., temperature) given that Old Tampa Bay (northwest segment) has circulation dynamics that contributed to regulatory exceedances</w:t>
       </w:r>
       <w:r>
         <w:rPr>
@@ -425,7 +449,7 @@
           <w:i/>
           <w:iCs/>
         </w:rPr>
-        <w:t xml:space="preserve">and salinity can serve as a proxy to better understand these effects.”</w:t>
+        <w:t xml:space="preserve">and salinity can serve as a proxy to better understand these effects. Future analysis of temperature effects could be beneficial.”</w:t>
       </w:r>
     </w:p>
     <w:p>
@@ -584,7 +608,7 @@
           <w:i/>
           <w:iCs/>
         </w:rPr>
-        <w:t xml:space="preserve">(line 169).</w:t>
+        <w:t xml:space="preserve">(line 171).</w:t>
       </w:r>
     </w:p>
     <w:p>
@@ -652,7 +676,7 @@
           <w:i/>
           <w:iCs/>
         </w:rPr>
-        <w:t xml:space="preserve">was added since this was the origin of the concept (line 220).</w:t>
+        <w:t xml:space="preserve">was added since this was the origin of the concept (line 222).</w:t>
       </w:r>
     </w:p>
     <w:p>
@@ -684,7 +708,7 @@
           <w:i/>
           <w:iCs/>
         </w:rPr>
-        <w:t xml:space="preserve">Lines 240-242:</w:t>
+        <w:t xml:space="preserve">Lines 242-244:</w:t>
       </w:r>
       <w:r>
         <w:rPr>
@@ -753,21 +777,21 @@
           <w:i/>
           <w:iCs/>
         </w:rPr>
-        <w:t xml:space="preserve">“minimum and maximum observed over the period of record for each bay segment”</w:t>
-      </w:r>
-      <w:r>
-        <w:rPr>
-          <w:i/>
-          <w:iCs/>
-        </w:rPr>
-        <w:t xml:space="preserve"> </w:t>
-      </w:r>
-      <w:r>
-        <w:rPr>
-          <w:i/>
-          <w:iCs/>
-        </w:rPr>
-        <w:t xml:space="preserve">(lines 283-284).</w:t>
+        <w:t xml:space="preserve">“minimum and maximum observed over the period of record for each bay segment, 1985-2024”</w:t>
+      </w:r>
+      <w:r>
+        <w:rPr>
+          <w:i/>
+          <w:iCs/>
+        </w:rPr>
+        <w:t xml:space="preserve"> </w:t>
+      </w:r>
+      <w:r>
+        <w:rPr>
+          <w:i/>
+          <w:iCs/>
+        </w:rPr>
+        <w:t xml:space="preserve">(lines 285-286).</w:t>
       </w:r>
     </w:p>
     <w:p>
@@ -787,7 +811,7 @@
           <w:i/>
           <w:iCs/>
         </w:rPr>
-        <w:t xml:space="preserve">This was also the mean loading for the period of record for each bay segment, similar to salinity. Text was modified similarly as the previous response (lines 291-292).</w:t>
+        <w:t xml:space="preserve">This was also the mean loading for the period of record for each bay segment, similar to salinity. Text was modified similarly as the previous response (lines 293-294).</w:t>
       </w:r>
     </w:p>
     <w:p>
@@ -807,7 +831,7 @@
           <w:i/>
           <w:iCs/>
         </w:rPr>
-        <w:t xml:space="preserve">Yes, the chlorophyll-a thresholds are FDEP standards under the bay’s Reasonable Assurance Plan. A citation to Figure 2 was included and</w:t>
+        <w:t xml:space="preserve">Yes, the chlorophyll-a thresholds are FDEP standards under the bay’s Reasonable Assurance Plan and §62-302.532, Florida Administrative Code. A citation to Figure 2 was included and</w:t>
       </w:r>
       <w:r>
         <w:rPr>
@@ -835,7 +859,7 @@
           <w:i/>
           <w:iCs/>
         </w:rPr>
-        <w:t xml:space="preserve">was added as a text qualifier for the chlorophyll-a thresholds (lines 345-349).</w:t>
+        <w:t xml:space="preserve">was added as a text qualifier for the chlorophyll-a thresholds (lines 347-351).</w:t>
       </w:r>
     </w:p>
     <w:p>
@@ -875,7 +899,7 @@
           <w:i/>
           <w:iCs/>
         </w:rPr>
-        <w:t xml:space="preserve">Yes, this is correct, although we note that the journal discourages general statements about p-values. We revised the sentence to include more detail about these main effects (lines 383-387):</w:t>
+        <w:t xml:space="preserve">Yes, this is correct, although we note that the journal discourages general statements about p-values. We revised the sentence to include more detail about these main effects (lines 385-389):</w:t>
       </w:r>
       <w:r>
         <w:rPr>
@@ -909,7 +933,7 @@
           <w:i/>
           <w:iCs/>
         </w:rPr>
-        <w:t xml:space="preserve">Since stratification does not occur regularly in Tampa Bay, the decreased fit in the wet season is likely due to higher variability in chlorophyll-a and additional factors beyond those included in the model that could influence primary productivity. Conversely, it is very possible that chlorophyll-a during the dry season is captured more fully by the time variables in the model (decimal time, day of year) as other parameters have less of an influence outside of the growing season. We agree, though, that these results are not particularly surprising, but it is worth explaining times when the models performed better or worse to help the reader understand factors that could influence chlorophyll-a dynamics.</w:t>
+        <w:t xml:space="preserve">Since stratification does not occur regularly in Tampa Bay, the decreased fit in the wet season is likely due to higher variability in chlorophyll-a and additional factors beyond those included in the model that could influence primary productivity. Conversely, it is very possible that chlorophyll-a during the dry season is captured more fully by the time variables in the model (decimal time, day of year) as other parameters have less influence outside of the growing season. We agree, though, that these results are not particularly surprising, but it is worth explaining times when the models performed better or worse to help the reader understand factors that could influence chlorophyll-a dynamics.</w:t>
       </w:r>
     </w:p>
     <w:p>
@@ -949,7 +973,7 @@
           <w:i/>
           <w:iCs/>
         </w:rPr>
-        <w:t xml:space="preserve">For subfigure (a), we retain the separate scaling because we feel it is important to help visualize differences between years within each bay segment. However, we have removed the path connection between years to help declutter the plots. For subfigure (b), the axes are now fixed to better emphasize scale comparisons between sub-segments. The caption was updated to describe this rationale (line 655):</w:t>
+        <w:t xml:space="preserve">For subfigure (a), we retain the separate scaling because we feel it is important to help visualize differences between years within each bay segment. However, we have removed the path connection between years to help declutter the plots. For subfigure (b), the axes are now fixed to better emphasize scale comparisons between sub-segments. The caption was updated to describe this rationale (line 657):</w:t>
       </w:r>
       <w:r>
         <w:rPr>
@@ -1018,7 +1042,7 @@
           <w:i/>
           <w:iCs/>
         </w:rPr>
-        <w:t xml:space="preserve">(line 586). As is the premise of this paragraph, the specific causal mechanism for which salinity serves as a proxy cannot be known without additional data. Our interpretation in this paragraph elucidates some potential reasons to allow the reader to make a more informed assessment as to how multiple factors influence phytoplankton growth. Salinity is simply a rough measure for these drivers, as stated throughout.</w:t>
+        <w:t xml:space="preserve">(line 588). As is the premise of this paragraph, the specific causal mechanism for which salinity serves as a proxy cannot be known without additional data. Our interpretation in this paragraph elucidates some potential reasons to allow the reader to make a more informed assessment as to how multiple factors influence phytoplankton growth. Salinity is simply a rough measure for these drivers, as stated throughout.</w:t>
       </w:r>
     </w:p>
     <w:bookmarkEnd w:id="23"/>
@@ -1077,7 +1101,7 @@
           <w:i/>
           <w:iCs/>
         </w:rPr>
-        <w:t xml:space="preserve">That being said, none of these additions speak directly to EDA, variable selection, or model structure. The reviewer rightfully points out that we did not sufficiently justify the chosen form of the model. However, our initial analyses did indeed evaluate different forms of the predictors, particularly in how loadings were evaluated (as lags or not) and if model fit could be improved by attempting to remove seasonality or the effects of one predictor within another (i.e., taking the residuals of a fit of loading against salinity to remove the effects of the latter from the former). We also evaluated if constraining the number of knots in the decimal time smoother allowed the variation in chlorophyll to be better explained by the other smoothers. The results of these exploratory analyses were included in supplemental tables. Model fit was not improved using different derivations of the input parameters and smoothing constraints. Our chosen model, therefore, represents the results of this initial exploratory analysis as described in section 2.2.</w:t>
+        <w:t xml:space="preserve">However, we agree that these additions do not directly address the reviewer’s concerns regarding EDA, variable selection, or model structure. The reviewer rightfully points out that we did not sufficiently justify the chosen form of the model. However, in the Introduction, we introduce nutrient loads and hydrodynamics as the two major forces influencing eutrophication in an estuary (Lines 70-88). Therefore, nitrogen and salinity were selected as proxies for these forces. In addition, our initial analyses did indeed evaluate different forms of the predictors, particularly in how loadings were evaluated (as lags or not) and if model fit could be improved by attempting to remove seasonality or the effects of one predictor within another (i.e., taking the residuals of a fit of loading against salinity to remove the effects of the latter from the former). We also evaluated if constraining the number of knots in the decimal time smoother allowed the variation in chlorophyll to be better explained by the other smoothers. The results of these exploratory analyses were included in supplemental tables. Model fit was not improved using different derivations of the input parameters and smoothing constraints. Our chosen model, therefore, represents the results of this initial exploratory analysis as described in section 2.2.</w:t>
       </w:r>
     </w:p>
     <w:p>
@@ -1271,7 +1295,7 @@
           <w:i/>
           <w:iCs/>
         </w:rPr>
-        <w:t xml:space="preserve">Lines 226-230:</w:t>
+        <w:t xml:space="preserve">Lines 228-232:</w:t>
       </w:r>
       <w:r>
         <w:rPr>
@@ -1377,7 +1401,7 @@
           <w:i/>
           <w:iCs/>
         </w:rPr>
-        <w:t xml:space="preserve">Lines 248-251:</w:t>
+        <w:t xml:space="preserve">Lines 250-253:</w:t>
       </w:r>
       <w:r>
         <w:rPr>
@@ -1550,7 +1574,7 @@
           <w:i/>
           <w:iCs/>
         </w:rPr>
-        <w:t xml:space="preserve">(a citation was added to line 220 to make this connection). The interactions of the other parameters with the different time variables were also considered important given what we suspect about changing ecological baselines in Tampa Bay, e.g., loading effects may vary over time either through changes long-term or seasonally. The addition of Figure S3 helps visualize these modeled interactions.</w:t>
+        <w:t xml:space="preserve">(a citation was added to line 222 to make this connection). The interactions of the other parameters with the different time variables were also considered important given what we suspect about changing ecological baselines in Tampa Bay, e.g., loading effects may vary over time either through changes long-term or seasonally. The addition of Figure S3 helps visualize these modeled interactions.</w:t>
       </w:r>
     </w:p>
     <w:p>
@@ -1663,7 +1687,7 @@
       </w:r>
     </w:p>
     <w:bookmarkEnd w:id="24"/>
-    <w:bookmarkStart w:id="46" w:name="references"/>
+    <w:bookmarkStart w:id="48" w:name="references"/>
     <w:p>
       <w:pPr>
         <w:pStyle w:val="Heading2"/>
@@ -1672,7 +1696,7 @@
         <w:t xml:space="preserve">References</w:t>
       </w:r>
     </w:p>
-    <w:bookmarkStart w:id="45" w:name="refs"/>
+    <w:bookmarkStart w:id="47" w:name="refs"/>
     <w:bookmarkStart w:id="26" w:name="ref-akaike1974"/>
     <w:p>
       <w:pPr>
@@ -1816,12 +1840,70 @@
       </w:r>
     </w:p>
     <w:bookmarkEnd w:id="30"/>
-    <w:bookmarkStart w:id="32" w:name="ref-hirsch2010"/>
+    <w:bookmarkStart w:id="32" w:name="ref-chen2019"/>
     <w:p>
       <w:pPr>
         <w:pStyle w:val="Bibliography"/>
       </w:pPr>
       <w:r>
+        <w:t xml:space="preserve">Chen, J., R. H. Weisberg, Y. Liu, L. Zheng, and J. Zhu. 2019. On the momentum balance of</w:t>
+      </w:r>
+      <w:r>
+        <w:t xml:space="preserve"> </w:t>
+      </w:r>
+      <w:r>
+        <w:t xml:space="preserve">T</w:t>
+      </w:r>
+      <w:r>
+        <w:t xml:space="preserve">ampa</w:t>
+      </w:r>
+      <w:r>
+        <w:t xml:space="preserve"> </w:t>
+      </w:r>
+      <w:r>
+        <w:t xml:space="preserve">B</w:t>
+      </w:r>
+      <w:r>
+        <w:t xml:space="preserve">ay.</w:t>
+      </w:r>
+      <w:r>
+        <w:t xml:space="preserve"> </w:t>
+      </w:r>
+      <w:r>
+        <w:rPr>
+          <w:i/>
+          <w:iCs/>
+        </w:rPr>
+        <w:t xml:space="preserve">Journal of Geophysical Research: Oceans</w:t>
+      </w:r>
+      <w:r>
+        <w:t xml:space="preserve"> </w:t>
+      </w:r>
+      <w:r>
+        <w:t xml:space="preserve">124: 4492–4510.</w:t>
+      </w:r>
+      <w:r>
+        <w:t xml:space="preserve"> </w:t>
+      </w:r>
+      <w:hyperlink r:id="rId31">
+        <w:r>
+          <w:rPr>
+            <w:rStyle w:val="Hyperlink"/>
+          </w:rPr>
+          <w:t xml:space="preserve">https://doi.org/10.1029/2018JC014890</w:t>
+        </w:r>
+      </w:hyperlink>
+      <w:r>
+        <w:t xml:space="preserve">.</w:t>
+      </w:r>
+    </w:p>
+    <w:bookmarkEnd w:id="32"/>
+    <w:bookmarkStart w:id="34" w:name="ref-hirsch2010"/>
+    <w:p>
+      <w:pPr>
+        <w:pStyle w:val="Bibliography"/>
+      </w:pPr>
+      <w:r>
         <w:t xml:space="preserve">Hirsch, R. M., D. L. Moyer, and S. A. Archfield. 2010. Weighted regressions on time, discharge, and season (</w:t>
       </w:r>
       <w:r>
@@ -1867,7 +1949,7 @@
       <w:r>
         <w:t xml:space="preserve"> </w:t>
       </w:r>
-      <w:hyperlink r:id="rId31">
+      <w:hyperlink r:id="rId33">
         <w:r>
           <w:rPr>
             <w:rStyle w:val="Hyperlink"/>
@@ -1879,8 +1961,8 @@
         <w:t xml:space="preserve">.</w:t>
       </w:r>
     </w:p>
-    <w:bookmarkEnd w:id="32"/>
-    <w:bookmarkStart w:id="33" w:name="ref-janicki23"/>
+    <w:bookmarkEnd w:id="34"/>
+    <w:bookmarkStart w:id="35" w:name="ref-janicki23"/>
     <w:p>
       <w:pPr>
         <w:pStyle w:val="Bibliography"/>
@@ -1923,8 +2005,8 @@
         <w:t xml:space="preserve">86: 255–263.</w:t>
       </w:r>
     </w:p>
-    <w:bookmarkEnd w:id="33"/>
-    <w:bookmarkStart w:id="35" w:name="ref-luther2022"/>
+    <w:bookmarkEnd w:id="35"/>
+    <w:bookmarkStart w:id="37" w:name="ref-luther2022"/>
     <w:p>
       <w:pPr>
         <w:pStyle w:val="Bibliography"/>
@@ -1935,7 +2017,7 @@
       <w:r>
         <w:t xml:space="preserve"> </w:t>
       </w:r>
-      <w:hyperlink r:id="rId34">
+      <w:hyperlink r:id="rId36">
         <w:r>
           <w:rPr>
             <w:rStyle w:val="Hyperlink"/>
@@ -2021,8 +2103,8 @@
         <w:t xml:space="preserve">. 08-22. St. Petersburg, Florida: Tampa Bay Estuary Program.</w:t>
       </w:r>
     </w:p>
-    <w:bookmarkEnd w:id="35"/>
-    <w:bookmarkStart w:id="37" w:name="ref-murphy19"/>
+    <w:bookmarkEnd w:id="37"/>
+    <w:bookmarkStart w:id="39" w:name="ref-murphy19"/>
     <w:p>
       <w:pPr>
         <w:pStyle w:val="Bibliography"/>
@@ -2067,7 +2149,7 @@
       <w:r>
         <w:t xml:space="preserve"> </w:t>
       </w:r>
-      <w:hyperlink r:id="rId36">
+      <w:hyperlink r:id="rId38">
         <w:r>
           <w:rPr>
             <w:rStyle w:val="Hyperlink"/>
@@ -2079,8 +2161,8 @@
         <w:t xml:space="preserve">.</w:t>
       </w:r>
     </w:p>
-    <w:bookmarkEnd w:id="37"/>
-    <w:bookmarkStart w:id="39" w:name="ref-sherwood2015"/>
+    <w:bookmarkEnd w:id="39"/>
+    <w:bookmarkStart w:id="41" w:name="ref-sherwood2015"/>
     <w:p>
       <w:pPr>
         <w:pStyle w:val="Bibliography"/>
@@ -2091,7 +2173,7 @@
       <w:r>
         <w:t xml:space="preserve"> </w:t>
       </w:r>
-      <w:hyperlink r:id="rId38">
+      <w:hyperlink r:id="rId40">
         <w:r>
           <w:rPr>
             <w:rStyle w:val="Hyperlink"/>
@@ -2177,8 +2259,8 @@
         <w:t xml:space="preserve">. 10-15. St. Petersburg, Florida: Tampa Bay Estuary Program.</w:t>
       </w:r>
     </w:p>
-    <w:bookmarkEnd w:id="39"/>
-    <w:bookmarkStart w:id="41" w:name="ref-wood11"/>
+    <w:bookmarkEnd w:id="41"/>
+    <w:bookmarkStart w:id="43" w:name="ref-wood11"/>
     <w:p>
       <w:pPr>
         <w:pStyle w:val="Bibliography"/>
@@ -2205,7 +2287,7 @@
       <w:r>
         <w:t xml:space="preserve"> </w:t>
       </w:r>
-      <w:hyperlink r:id="rId40">
+      <w:hyperlink r:id="rId42">
         <w:r>
           <w:rPr>
             <w:rStyle w:val="Hyperlink"/>
@@ -2217,8 +2299,8 @@
         <w:t xml:space="preserve">.</w:t>
       </w:r>
     </w:p>
-    <w:bookmarkEnd w:id="41"/>
-    <w:bookmarkStart w:id="42" w:name="ref-wood17"/>
+    <w:bookmarkEnd w:id="43"/>
+    <w:bookmarkStart w:id="44" w:name="ref-wood17"/>
     <w:p>
       <w:pPr>
         <w:pStyle w:val="Bibliography"/>
@@ -2296,8 +2378,8 @@
         <w:t xml:space="preserve">. 2nd ed. Chapman; Hall/CRC.</w:t>
       </w:r>
     </w:p>
-    <w:bookmarkEnd w:id="42"/>
-    <w:bookmarkStart w:id="44" w:name="ref-tbep0494"/>
+    <w:bookmarkEnd w:id="44"/>
+    <w:bookmarkStart w:id="46" w:name="ref-tbep0494"/>
     <w:p>
       <w:pPr>
         <w:pStyle w:val="Bibliography"/>
@@ -2308,7 +2390,7 @@
       <w:r>
         <w:t xml:space="preserve"> </w:t>
       </w:r>
-      <w:hyperlink r:id="rId43">
+      <w:hyperlink r:id="rId45">
         <w:r>
           <w:rPr>
             <w:rStyle w:val="Hyperlink"/>
@@ -2394,9 +2476,9 @@
         <w:t xml:space="preserve">. Technical report 04-94. St. Petersburg, Florida: Tampa Bay Estuary Program.</w:t>
       </w:r>
     </w:p>
-    <w:bookmarkEnd w:id="44"/>
-    <w:bookmarkEnd w:id="45"/>
     <w:bookmarkEnd w:id="46"/>
+    <w:bookmarkEnd w:id="47"/>
+    <w:bookmarkEnd w:id="48"/>
     <w:sectPr>
       <w:footerReference r:id="rId9" w:type="default"/>
       <w:pgSz w:h="15840" w:w="12240"/>

</xml_diff>